<commit_message>
Calibrated-detector results: the estimator's advantage, and where it fails
</commit_message>
<xml_diff>
--- a/aamganak/CREST_REPORT.docx
+++ b/aamganak/CREST_REPORT.docx
@@ -28,7 +28,7 @@
         </w:p>
       </w:sdtContent>
     </w:sdt>
-    <w:bookmarkStart w:id="69" w:name="X31220271ecbc526c6ca7b619381978f1787cad8"/>
+    <w:bookmarkStart w:id="75" w:name="X31220271ecbc526c6ca7b619381978f1787cad8"/>
     <w:p>
       <w:pPr>
         <w:pStyle w:val="Heading1"/>
@@ -304,19 +304,25 @@
         <w:t xml:space="preserve"> </w:t>
       </w:r>
       <w:r>
-        <w:t xml:space="preserve">mean absolute error of 1.5% in total count from three viewpoints, against 3.5% for the fitted</w:t>
-      </w:r>
-      <w:r>
-        <w:t xml:space="preserve"> </w:t>
-      </w:r>
-      <w:r>
-        <w:t xml:space="preserve">multiplier and 8.1% for counting what is visible. Three viewpoints with it were more accurate than</w:t>
-      </w:r>
-      <w:r>
-        <w:t xml:space="preserve"> </w:t>
-      </w:r>
-      <w:r>
-        <w:t xml:space="preserve">twelve without. The measurement that would confirm this on real fruit is a harvest away.</w:t>
+        <w:t xml:space="preserve">mean absolute error of 3.5% in total count from three viewpoints, against 7.9% for the fitted</w:t>
+      </w:r>
+      <w:r>
+        <w:t xml:space="preserve"> </w:t>
+      </w:r>
+      <w:r>
+        <w:t xml:space="preserve">multiplier and 24.5% for counting what is found. Three viewpoints with it matched twelve without.</w:t>
+      </w:r>
+      <w:r>
+        <w:t xml:space="preserve"> </w:t>
+      </w:r>
+      <w:r>
+        <w:t xml:space="preserve">It fails in one specific place, on two viewpoints with a poor detector, where a blunt constant</w:t>
+      </w:r>
+      <w:r>
+        <w:t xml:space="preserve"> </w:t>
+      </w:r>
+      <w:r>
+        <w:t xml:space="preserve">beats it. The measurement that would confirm any of this on real fruit is a harvest away.</w:t>
       </w:r>
     </w:p>
     <w:p>
@@ -2663,19 +2669,31 @@
         <w:t xml:space="preserve"> </w:t>
       </w:r>
       <w:r>
-        <w:t xml:space="preserve">reproduces both published figures at once: 35% of fruit detected from one viewpoint against their</w:t>
-      </w:r>
-      <w:r>
-        <w:t xml:space="preserve"> </w:t>
-      </w:r>
-      <w:r>
-        <w:t xml:space="preserve">40.2% from dual view, and 62% from two viewpoints against their 62.3% from video tracking. Matching</w:t>
-      </w:r>
-      <w:r>
-        <w:t xml:space="preserve"> </w:t>
-      </w:r>
-      <w:r>
-        <w:t xml:space="preserve">both from a single setting is closer agreement than I expected.</w:t>
+        <w:t xml:space="preserve">reproduces both published figures at once: 37% of fruit found from one viewpoint against their</w:t>
+      </w:r>
+      <w:r>
+        <w:t xml:space="preserve"> </w:t>
+      </w:r>
+      <w:r>
+        <w:t xml:space="preserve">40.2% from dual view, and 61% from two viewpoints against their 62.3% from video tracking. The</w:t>
+      </w:r>
+      <w:r>
+        <w:t xml:space="preserve"> </w:t>
+      </w:r>
+      <w:r>
+        <w:t xml:space="preserve">correction factors my trees then demand, from 2.99 at one viewpoint to 1.04 at twelve, span the</w:t>
+      </w:r>
+      <w:r>
+        <w:t xml:space="preserve"> </w:t>
+      </w:r>
+      <w:r>
+        <w:t xml:space="preserve">1.05 to 2.43 measured across real orchards. Matching three separate published quantities from one</w:t>
+      </w:r>
+      <w:r>
+        <w:t xml:space="preserve"> </w:t>
+      </w:r>
+      <w:r>
+        <w:t xml:space="preserve">setting is closer agreement than I expected.</w:t>
       </w:r>
     </w:p>
     <w:p>
@@ -2860,7 +2878,7 @@
     </w:p>
     <w:bookmarkEnd w:id="31"/>
     <w:bookmarkEnd w:id="32"/>
-    <w:bookmarkStart w:id="55" w:name="results"/>
+    <w:bookmarkStart w:id="61" w:name="results"/>
     <w:p>
       <w:pPr>
         <w:pStyle w:val="Heading2"/>
@@ -2898,7 +2916,7 @@
         <w:t xml:space="preserve">trees. No number here was measured on a real tree.</w:t>
       </w:r>
     </w:p>
-    <w:bookmarkStart w:id="33" w:name="how-much-a-camera-misses"/>
+    <w:bookmarkStart w:id="35" w:name="how-much-a-camera-misses"/>
     <w:p>
       <w:pPr>
         <w:pStyle w:val="Heading3"/>
@@ -2912,23 +2930,128 @@
         <w:pStyle w:val="FirstParagraph"/>
       </w:pPr>
       <w:r>
-        <w:t xml:space="preserve">From a single viewpoint, 40% of fruit are never seen. From two, 15%. From twelve, 2%. Counting what is</w:t>
-      </w:r>
-      <w:r>
-        <w:t xml:space="preserve"> </w:t>
-      </w:r>
-      <w:r>
-        <w:t xml:space="preserve">visible is therefore 43.1% low at one viewpoint and 2.1% low at twelve, which is the whole shape of the</w:t>
-      </w:r>
-      <w:r>
-        <w:t xml:space="preserve"> </w:t>
-      </w:r>
-      <w:r>
-        <w:t xml:space="preserve">problem in two numbers.</w:t>
-      </w:r>
-    </w:p>
-    <w:bookmarkEnd w:id="33"/>
-    <w:bookmarkStart w:id="40" w:name="accuracy-against-effort"/>
+        <w:t xml:space="preserve">From a single viewpoint, 24% of fruit have no clear line of sight from anywhere, and once the</w:t>
+      </w:r>
+      <w:r>
+        <w:t xml:space="preserve"> </w:t>
+      </w:r>
+      <w:r>
+        <w:t xml:space="preserve">detector’s own misses are added only 37% are found at all. Two viewpoints find 61%, three find 76%,</w:t>
+      </w:r>
+      <w:r>
+        <w:t xml:space="preserve"> </w:t>
+      </w:r>
+      <w:r>
+        <w:t xml:space="preserve">and twelve find 97%. Counting what is found is therefore 63.2% low at one viewpoint and 3.5% low at</w:t>
+      </w:r>
+      <w:r>
+        <w:t xml:space="preserve"> </w:t>
+      </w:r>
+      <w:r>
+        <w:t xml:space="preserve">twelve, which is the shape of the problem in two numbers.</w:t>
+      </w:r>
+    </w:p>
+    <w:p>
+      <w:pPr>
+        <w:pStyle w:val="BodyText"/>
+      </w:pPr>
+      <w:r>
+        <w:t xml:space="preserve">A second check falls out of this. The correction factor needed to repair the visible count, fitted</w:t>
+      </w:r>
+      <w:r>
+        <w:t xml:space="preserve"> </w:t>
+      </w:r>
+      <w:r>
+        <w:t xml:space="preserve">the way the field fits it, runs from 2.99 at one viewpoint down to 1.04 at twelve. Published factors</w:t>
+      </w:r>
+      <w:r>
+        <w:t xml:space="preserve"> </w:t>
+      </w:r>
+      <w:r>
+        <w:t xml:space="preserve">measured across real orchards run from 1.05 to 2.43. My simulated trees demand corrections of the</w:t>
+      </w:r>
+      <w:r>
+        <w:t xml:space="preserve"> </w:t>
+      </w:r>
+      <w:r>
+        <w:t xml:space="preserve">same size as real ones, which is reassuring about the trees rather than about the estimator.</w:t>
+      </w:r>
+    </w:p>
+    <w:p>
+      <w:pPr>
+        <w:pStyle w:val="BodyText"/>
+      </w:pPr>
+      <w:r>
+        <w:drawing>
+          <wp:inline>
+            <wp:extent cx="5153056" cy="3315082"/>
+            <wp:effectExtent b="0" l="0" r="0" t="0"/>
+            <wp:docPr descr="Figure 1" title="" id="33" name="Picture"/>
+            <a:graphic>
+              <a:graphicData uri="http://schemas.openxmlformats.org/drawingml/2006/picture">
+                <pic:pic>
+                  <pic:nvPicPr>
+                    <pic:cNvPr descr="artifacts/figs/fig1_visibility_vs_views.png" id="34" name="Picture"/>
+                    <pic:cNvPicPr>
+                      <a:picLocks noChangeArrowheads="1" noChangeAspect="1"/>
+                    </pic:cNvPicPr>
+                  </pic:nvPicPr>
+                  <pic:blipFill>
+                    <a:blip r:embed="rId27"/>
+                    <a:stretch>
+                      <a:fillRect/>
+                    </a:stretch>
+                  </pic:blipFill>
+                  <pic:spPr bwMode="auto">
+                    <a:xfrm>
+                      <a:off x="0" y="0"/>
+                      <a:ext cx="5153056" cy="3315082"/>
+                    </a:xfrm>
+                    <a:prstGeom prst="rect">
+                      <a:avLst/>
+                    </a:prstGeom>
+                    <a:noFill/>
+                    <a:ln w="9525">
+                      <a:noFill/>
+                      <a:headEnd/>
+                      <a:tailEnd/>
+                    </a:ln>
+                  </pic:spPr>
+                </pic:pic>
+              </a:graphicData>
+            </a:graphic>
+          </wp:inline>
+        </w:drawing>
+      </w:r>
+    </w:p>
+    <w:p>
+      <w:pPr>
+        <w:pStyle w:val="BodyText"/>
+      </w:pPr>
+      <w:r>
+        <w:rPr>
+          <w:i/>
+          <w:iCs/>
+        </w:rPr>
+        <w:t xml:space="preserve">Figure 1. Fruit found and fruit never visible, against viewpoint count, with the two published</w:t>
+      </w:r>
+      <w:r>
+        <w:rPr>
+          <w:i/>
+          <w:iCs/>
+        </w:rPr>
+        <w:t xml:space="preserve"> </w:t>
+      </w:r>
+      <w:r>
+        <w:rPr>
+          <w:i/>
+          <w:iCs/>
+        </w:rPr>
+        <w:t xml:space="preserve">field measurements marked.</w:t>
+      </w:r>
+    </w:p>
+    <w:bookmarkEnd w:id="35"/>
+    <w:bookmarkStart w:id="42" w:name="accuracy-against-effort"/>
     <w:p>
       <w:pPr>
         <w:pStyle w:val="Heading3"/>
@@ -3034,18 +3157,18 @@
               <w:pStyle w:val="Compact"/>
             </w:pPr>
             <w:r>
-              <w:t xml:space="preserve">43.1%</w:t>
-            </w:r>
-          </w:p>
-        </w:tc>
-        <w:tc>
-          <w:tcPr/>
-          <w:p>
-            <w:pPr>
-              <w:pStyle w:val="Compact"/>
-            </w:pPr>
-            <w:r>
-              <w:t xml:space="preserve">14.2%</w:t>
+              <w:t xml:space="preserve">63.2%</w:t>
+            </w:r>
+          </w:p>
+        </w:tc>
+        <w:tc>
+          <w:tcPr/>
+          <w:p>
+            <w:pPr>
+              <w:pStyle w:val="Compact"/>
+            </w:pPr>
+            <w:r>
+              <w:t xml:space="preserve">18.3%</w:t>
             </w:r>
           </w:p>
         </w:tc>
@@ -3091,29 +3214,29 @@
               <w:pStyle w:val="Compact"/>
             </w:pPr>
             <w:r>
-              <w:t xml:space="preserve">17.7%</w:t>
-            </w:r>
-          </w:p>
-        </w:tc>
-        <w:tc>
-          <w:tcPr/>
-          <w:p>
-            <w:pPr>
-              <w:pStyle w:val="Compact"/>
-            </w:pPr>
-            <w:r>
-              <w:t xml:space="preserve">6.2%</w:t>
-            </w:r>
-          </w:p>
-        </w:tc>
-        <w:tc>
-          <w:tcPr/>
-          <w:p>
-            <w:pPr>
-              <w:pStyle w:val="Compact"/>
-            </w:pPr>
-            <w:r>
-              <w:t xml:space="preserve">6.4%</w:t>
+              <w:t xml:space="preserve">38.9%</w:t>
+            </w:r>
+          </w:p>
+        </w:tc>
+        <w:tc>
+          <w:tcPr/>
+          <w:p>
+            <w:pPr>
+              <w:pStyle w:val="Compact"/>
+            </w:pPr>
+            <w:r>
+              <w:t xml:space="preserve">11.1%</w:t>
+            </w:r>
+          </w:p>
+        </w:tc>
+        <w:tc>
+          <w:tcPr/>
+          <w:p>
+            <w:pPr>
+              <w:pStyle w:val="Compact"/>
+            </w:pPr>
+            <w:r>
+              <w:t xml:space="preserve">15.9%</w:t>
             </w:r>
           </w:p>
         </w:tc>
@@ -3128,7 +3251,7 @@
                 <w:b/>
                 <w:bCs/>
               </w:rPr>
-              <w:t xml:space="preserve">2.3%</w:t>
+              <w:t xml:space="preserve">9.5%</w:t>
             </w:r>
           </w:p>
         </w:tc>
@@ -3152,29 +3275,29 @@
               <w:pStyle w:val="Compact"/>
             </w:pPr>
             <w:r>
-              <w:t xml:space="preserve">8.1%</w:t>
-            </w:r>
-          </w:p>
-        </w:tc>
-        <w:tc>
-          <w:tcPr/>
-          <w:p>
-            <w:pPr>
-              <w:pStyle w:val="Compact"/>
-            </w:pPr>
-            <w:r>
-              <w:t xml:space="preserve">3.5%</w:t>
-            </w:r>
-          </w:p>
-        </w:tc>
-        <w:tc>
-          <w:tcPr/>
-          <w:p>
-            <w:pPr>
-              <w:pStyle w:val="Compact"/>
-            </w:pPr>
-            <w:r>
-              <w:t xml:space="preserve">1.5%</w:t>
+              <w:t xml:space="preserve">24.5%</w:t>
+            </w:r>
+          </w:p>
+        </w:tc>
+        <w:tc>
+          <w:tcPr/>
+          <w:p>
+            <w:pPr>
+              <w:pStyle w:val="Compact"/>
+            </w:pPr>
+            <w:r>
+              <w:t xml:space="preserve">7.9%</w:t>
+            </w:r>
+          </w:p>
+        </w:tc>
+        <w:tc>
+          <w:tcPr/>
+          <w:p>
+            <w:pPr>
+              <w:pStyle w:val="Compact"/>
+            </w:pPr>
+            <w:r>
+              <w:t xml:space="preserve">3.8%</w:t>
             </w:r>
           </w:p>
         </w:tc>
@@ -3189,7 +3312,7 @@
                 <w:b/>
                 <w:bCs/>
               </w:rPr>
-              <w:t xml:space="preserve">1.5%</w:t>
+              <w:t xml:space="preserve">3.5%</w:t>
             </w:r>
           </w:p>
         </w:tc>
@@ -3213,29 +3336,151 @@
               <w:pStyle w:val="Compact"/>
             </w:pPr>
             <w:r>
-              <w:t xml:space="preserve">5.4%</w:t>
-            </w:r>
-          </w:p>
-        </w:tc>
-        <w:tc>
-          <w:tcPr/>
-          <w:p>
-            <w:pPr>
-              <w:pStyle w:val="Compact"/>
-            </w:pPr>
-            <w:r>
-              <w:t xml:space="preserve">2.3%</w:t>
-            </w:r>
-          </w:p>
-        </w:tc>
-        <w:tc>
-          <w:tcPr/>
-          <w:p>
-            <w:pPr>
-              <w:pStyle w:val="Compact"/>
-            </w:pPr>
-            <w:r>
-              <w:t xml:space="preserve">2.1%</w:t>
+              <w:t xml:space="preserve">17.3%</w:t>
+            </w:r>
+          </w:p>
+        </w:tc>
+        <w:tc>
+          <w:tcPr/>
+          <w:p>
+            <w:pPr>
+              <w:pStyle w:val="Compact"/>
+            </w:pPr>
+            <w:r>
+              <w:t xml:space="preserve">6.4%</w:t>
+            </w:r>
+          </w:p>
+        </w:tc>
+        <w:tc>
+          <w:tcPr/>
+          <w:p>
+            <w:pPr>
+              <w:pStyle w:val="Compact"/>
+            </w:pPr>
+            <w:r>
+              <w:t xml:space="preserve">3.4%</w:t>
+            </w:r>
+          </w:p>
+        </w:tc>
+        <w:tc>
+          <w:tcPr/>
+          <w:p>
+            <w:pPr>
+              <w:pStyle w:val="Compact"/>
+            </w:pPr>
+            <w:r>
+              <w:rPr>
+                <w:b/>
+                <w:bCs/>
+              </w:rPr>
+              <w:t xml:space="preserve">2.9%</w:t>
+            </w:r>
+          </w:p>
+        </w:tc>
+      </w:tr>
+      <w:tr>
+        <w:tc>
+          <w:tcPr/>
+          <w:p>
+            <w:pPr>
+              <w:pStyle w:val="Compact"/>
+            </w:pPr>
+            <w:r>
+              <w:t xml:space="preserve">6</w:t>
+            </w:r>
+          </w:p>
+        </w:tc>
+        <w:tc>
+          <w:tcPr/>
+          <w:p>
+            <w:pPr>
+              <w:pStyle w:val="Compact"/>
+            </w:pPr>
+            <w:r>
+              <w:t xml:space="preserve">8.9%</w:t>
+            </w:r>
+          </w:p>
+        </w:tc>
+        <w:tc>
+          <w:tcPr/>
+          <w:p>
+            <w:pPr>
+              <w:pStyle w:val="Compact"/>
+            </w:pPr>
+            <w:r>
+              <w:t xml:space="preserve">3.8%</w:t>
+            </w:r>
+          </w:p>
+        </w:tc>
+        <w:tc>
+          <w:tcPr/>
+          <w:p>
+            <w:pPr>
+              <w:pStyle w:val="Compact"/>
+            </w:pPr>
+            <w:r>
+              <w:t xml:space="preserve">3.1%</w:t>
+            </w:r>
+          </w:p>
+        </w:tc>
+        <w:tc>
+          <w:tcPr/>
+          <w:p>
+            <w:pPr>
+              <w:pStyle w:val="Compact"/>
+            </w:pPr>
+            <w:r>
+              <w:rPr>
+                <w:b/>
+                <w:bCs/>
+              </w:rPr>
+              <w:t xml:space="preserve">1.8%</w:t>
+            </w:r>
+          </w:p>
+        </w:tc>
+      </w:tr>
+      <w:tr>
+        <w:tc>
+          <w:tcPr/>
+          <w:p>
+            <w:pPr>
+              <w:pStyle w:val="Compact"/>
+            </w:pPr>
+            <w:r>
+              <w:t xml:space="preserve">12</w:t>
+            </w:r>
+          </w:p>
+        </w:tc>
+        <w:tc>
+          <w:tcPr/>
+          <w:p>
+            <w:pPr>
+              <w:pStyle w:val="Compact"/>
+            </w:pPr>
+            <w:r>
+              <w:t xml:space="preserve">3.5%</w:t>
+            </w:r>
+          </w:p>
+        </w:tc>
+        <w:tc>
+          <w:tcPr/>
+          <w:p>
+            <w:pPr>
+              <w:pStyle w:val="Compact"/>
+            </w:pPr>
+            <w:r>
+              <w:t xml:space="preserve">1.9%</w:t>
+            </w:r>
+          </w:p>
+        </w:tc>
+        <w:tc>
+          <w:tcPr/>
+          <w:p>
+            <w:pPr>
+              <w:pStyle w:val="Compact"/>
+            </w:pPr>
+            <w:r>
+              <w:t xml:space="preserve">3.0%</w:t>
             </w:r>
           </w:p>
         </w:tc>
@@ -3255,128 +3500,6 @@
           </w:p>
         </w:tc>
       </w:tr>
-      <w:tr>
-        <w:tc>
-          <w:tcPr/>
-          <w:p>
-            <w:pPr>
-              <w:pStyle w:val="Compact"/>
-            </w:pPr>
-            <w:r>
-              <w:t xml:space="preserve">6</w:t>
-            </w:r>
-          </w:p>
-        </w:tc>
-        <w:tc>
-          <w:tcPr/>
-          <w:p>
-            <w:pPr>
-              <w:pStyle w:val="Compact"/>
-            </w:pPr>
-            <w:r>
-              <w:t xml:space="preserve">2.9%</w:t>
-            </w:r>
-          </w:p>
-        </w:tc>
-        <w:tc>
-          <w:tcPr/>
-          <w:p>
-            <w:pPr>
-              <w:pStyle w:val="Compact"/>
-            </w:pPr>
-            <w:r>
-              <w:t xml:space="preserve">1.4%</w:t>
-            </w:r>
-          </w:p>
-        </w:tc>
-        <w:tc>
-          <w:tcPr/>
-          <w:p>
-            <w:pPr>
-              <w:pStyle w:val="Compact"/>
-            </w:pPr>
-            <w:r>
-              <w:t xml:space="preserve">2.3%</w:t>
-            </w:r>
-          </w:p>
-        </w:tc>
-        <w:tc>
-          <w:tcPr/>
-          <w:p>
-            <w:pPr>
-              <w:pStyle w:val="Compact"/>
-            </w:pPr>
-            <w:r>
-              <w:rPr>
-                <w:b/>
-                <w:bCs/>
-              </w:rPr>
-              <w:t xml:space="preserve">0.7%</w:t>
-            </w:r>
-          </w:p>
-        </w:tc>
-      </w:tr>
-      <w:tr>
-        <w:tc>
-          <w:tcPr/>
-          <w:p>
-            <w:pPr>
-              <w:pStyle w:val="Compact"/>
-            </w:pPr>
-            <w:r>
-              <w:t xml:space="preserve">12</w:t>
-            </w:r>
-          </w:p>
-        </w:tc>
-        <w:tc>
-          <w:tcPr/>
-          <w:p>
-            <w:pPr>
-              <w:pStyle w:val="Compact"/>
-            </w:pPr>
-            <w:r>
-              <w:t xml:space="preserve">2.1%</w:t>
-            </w:r>
-          </w:p>
-        </w:tc>
-        <w:tc>
-          <w:tcPr/>
-          <w:p>
-            <w:pPr>
-              <w:pStyle w:val="Compact"/>
-            </w:pPr>
-            <w:r>
-              <w:t xml:space="preserve">1.2%</w:t>
-            </w:r>
-          </w:p>
-        </w:tc>
-        <w:tc>
-          <w:tcPr/>
-          <w:p>
-            <w:pPr>
-              <w:pStyle w:val="Compact"/>
-            </w:pPr>
-            <w:r>
-              <w:t xml:space="preserve">2.1%</w:t>
-            </w:r>
-          </w:p>
-        </w:tc>
-        <w:tc>
-          <w:tcPr/>
-          <w:p>
-            <w:pPr>
-              <w:pStyle w:val="Compact"/>
-            </w:pPr>
-            <w:r>
-              <w:rPr>
-                <w:b/>
-                <w:bCs/>
-              </w:rPr>
-              <w:t xml:space="preserve">0.9%</w:t>
-            </w:r>
-          </w:p>
-        </w:tc>
-      </w:tr>
     </w:tbl>
     <w:p>
       <w:pPr>
@@ -3395,19 +3518,31 @@
         <w:pStyle w:val="BodyText"/>
       </w:pPr>
       <w:r>
-        <w:t xml:space="preserve">The reconstruction estimator is the most accurate at every viewpoint count where it is defined. At</w:t>
-      </w:r>
-      <w:r>
-        <w:t xml:space="preserve"> </w:t>
-      </w:r>
-      <w:r>
-        <w:t xml:space="preserve">two viewpoints it is 2.7 times more accurate than the fitted multiplier, and at six it is nearly twice as</w:t>
-      </w:r>
-      <w:r>
-        <w:t xml:space="preserve"> </w:t>
-      </w:r>
-      <w:r>
-        <w:t xml:space="preserve">accurate.</w:t>
+        <w:t xml:space="preserve">The reconstruction estimator is the most accurate at every viewpoint count where it is defined. Its</w:t>
+      </w:r>
+      <w:r>
+        <w:t xml:space="preserve"> </w:t>
+      </w:r>
+      <w:r>
+        <w:t xml:space="preserve">margin over the fitted multiplier is largest in the middle of the range, at 2.3 times better on</w:t>
+      </w:r>
+      <w:r>
+        <w:t xml:space="preserve"> </w:t>
+      </w:r>
+      <w:r>
+        <w:t xml:space="preserve">three viewpoints and 2.1 times on six, and narrows at both ends. At two viewpoints it is only 1.2</w:t>
+      </w:r>
+      <w:r>
+        <w:t xml:space="preserve"> </w:t>
+      </w:r>
+      <w:r>
+        <w:t xml:space="preserve">times better, because the detection histories are then too short to say much. At twelve there is</w:t>
+      </w:r>
+      <w:r>
+        <w:t xml:space="preserve"> </w:t>
+      </w:r>
+      <w:r>
+        <w:t xml:space="preserve">little left hidden for any method to recover.</w:t>
       </w:r>
     </w:p>
     <w:p>
@@ -3419,18 +3554,18 @@
           <wp:inline>
             <wp:extent cx="5309024" cy="3596436"/>
             <wp:effectExtent b="0" l="0" r="0" t="0"/>
-            <wp:docPr descr="Figure 2" title="" id="35" name="Picture"/>
+            <wp:docPr descr="Figure 2" title="" id="37" name="Picture"/>
             <a:graphic>
               <a:graphicData uri="http://schemas.openxmlformats.org/drawingml/2006/picture">
                 <pic:pic>
                   <pic:nvPicPr>
-                    <pic:cNvPr descr="artifacts/figs/fig2_accuracy_vs_views.png" id="36" name="Picture"/>
+                    <pic:cNvPr descr="artifacts/figs/fig2_accuracy_vs_views.png" id="38" name="Picture"/>
                     <pic:cNvPicPr>
                       <a:picLocks noChangeArrowheads="1" noChangeAspect="1"/>
                     </pic:cNvPicPr>
                   </pic:nvPicPr>
                   <pic:blipFill>
-                    <a:blip r:embed="rId34"/>
+                    <a:blip r:embed="rId36"/>
                     <a:stretch>
                       <a:fillRect/>
                     </a:stretch>
@@ -3524,18 +3659,18 @@
           <wp:inline>
             <wp:extent cx="5334000" cy="3206269"/>
             <wp:effectExtent b="0" l="0" r="0" t="0"/>
-            <wp:docPr descr="Figure 6" title="" id="38" name="Picture"/>
+            <wp:docPr descr="Figure 6" title="" id="40" name="Picture"/>
             <a:graphic>
               <a:graphicData uri="http://schemas.openxmlformats.org/drawingml/2006/picture">
                 <pic:pic>
                   <pic:nvPicPr>
-                    <pic:cNvPr descr="artifacts/figs/fig6_scatter_at_three_views.png" id="39" name="Picture"/>
+                    <pic:cNvPr descr="artifacts/figs/fig6_scatter_at_three_views.png" id="41" name="Picture"/>
                     <pic:cNvPicPr>
                       <a:picLocks noChangeArrowheads="1" noChangeAspect="1"/>
                     </pic:cNvPicPr>
                   </pic:nvPicPr>
                   <pic:blipFill>
-                    <a:blip r:embed="rId37"/>
+                    <a:blip r:embed="rId39"/>
                     <a:stretch>
                       <a:fillRect/>
                     </a:stretch>
@@ -3588,8 +3723,8 @@
         <w:t xml:space="preserve">agreement.</w:t>
       </w:r>
     </w:p>
-    <w:bookmarkEnd w:id="40"/>
-    <w:bookmarkStart w:id="44" w:name="the-same-accuracy-for-less-walking"/>
+    <w:bookmarkEnd w:id="42"/>
+    <w:bookmarkStart w:id="46" w:name="the-same-accuracy-for-less-walking"/>
     <w:p>
       <w:pPr>
         <w:pStyle w:val="Heading3"/>
@@ -3603,19 +3738,25 @@
         <w:pStyle w:val="FirstParagraph"/>
       </w:pPr>
       <w:r>
-        <w:t xml:space="preserve">Plain counting at twelve viewpoints reaches 2.1%. The reconstruction estimator reaches 1.5% at three</w:t>
-      </w:r>
-      <w:r>
-        <w:t xml:space="preserve"> </w:t>
-      </w:r>
-      <w:r>
-        <w:t xml:space="preserve">viewpoints, so three viewpoints with it are more accurate than twelve without. For a grower with two</w:t>
-      </w:r>
-      <w:r>
-        <w:t xml:space="preserve"> </w:t>
-      </w:r>
-      <w:r>
-        <w:t xml:space="preserve">hundred trees that is the difference between a morning and a day.</w:t>
+        <w:t xml:space="preserve">Plain counting at twelve viewpoints reaches 3.5%. The reconstruction estimator reaches 3.5% at three</w:t>
+      </w:r>
+      <w:r>
+        <w:t xml:space="preserve"> </w:t>
+      </w:r>
+      <w:r>
+        <w:t xml:space="preserve">viewpoints and 2.9% at four, so three viewpoints with it match twelve without, and four beat them.</w:t>
+      </w:r>
+      <w:r>
+        <w:t xml:space="preserve"> </w:t>
+      </w:r>
+      <w:r>
+        <w:t xml:space="preserve">The fitted multiplier never gets there: at twelve viewpoints it reaches 1.9%, but it needs all twelve</w:t>
+      </w:r>
+      <w:r>
+        <w:t xml:space="preserve"> </w:t>
+      </w:r>
+      <w:r>
+        <w:t xml:space="preserve">to do it. For a grower with two hundred trees that is the difference between a morning and a day.</w:t>
       </w:r>
     </w:p>
     <w:p>
@@ -3627,18 +3768,18 @@
           <wp:inline>
             <wp:extent cx="5334000" cy="2755900"/>
             <wp:effectExtent b="0" l="0" r="0" t="0"/>
-            <wp:docPr descr="Figure 3" title="" id="42" name="Picture"/>
+            <wp:docPr descr="Figure 3" title="" id="44" name="Picture"/>
             <a:graphic>
               <a:graphicData uri="http://schemas.openxmlformats.org/drawingml/2006/picture">
                 <pic:pic>
                   <pic:nvPicPr>
-                    <pic:cNvPr descr="artifacts/figs/fig3_effort_saving.png" id="43" name="Picture"/>
+                    <pic:cNvPr descr="artifacts/figs/fig3_effort_saving.png" id="45" name="Picture"/>
                     <pic:cNvPicPr>
                       <a:picLocks noChangeArrowheads="1" noChangeAspect="1"/>
                     </pic:cNvPicPr>
                   </pic:nvPicPr>
                   <pic:blipFill>
-                    <a:blip r:embed="rId41"/>
+                    <a:blip r:embed="rId43"/>
                     <a:stretch>
                       <a:fillRect/>
                     </a:stretch>
@@ -3677,8 +3818,8 @@
         <w:t xml:space="preserve">Figure 3. Viewpoints each method needs to match plain counting at twelve.</w:t>
       </w:r>
     </w:p>
-    <w:bookmarkEnd w:id="44"/>
-    <w:bookmarkStart w:id="45" w:name="X1dcf25566cdccdcdcda01650c77a746fddceebe"/>
+    <w:bookmarkEnd w:id="46"/>
+    <w:bookmarkStart w:id="47" w:name="X1dcf25566cdccdcdcda01650c77a746fddceebe"/>
     <w:p>
       <w:pPr>
         <w:pStyle w:val="Heading3"/>
@@ -3716,11 +3857,17 @@
         <w:t xml:space="preserve"> </w:t>
       </w:r>
       <w:r>
-        <w:t xml:space="preserve">photograph cannot support this family of methods at all.</w:t>
-      </w:r>
-    </w:p>
-    <w:bookmarkEnd w:id="45"/>
-    <w:bookmarkStart w:id="49" w:name="where-the-correction-earns-its-keep"/>
+        <w:t xml:space="preserve">photograph cannot support this family of methods at all, and the only thing available there is a</w:t>
+      </w:r>
+      <w:r>
+        <w:t xml:space="preserve"> </w:t>
+      </w:r>
+      <w:r>
+        <w:t xml:space="preserve">correction factor of about three, bought with a harvest.</w:t>
+      </w:r>
+    </w:p>
+    <w:bookmarkEnd w:id="47"/>
+    <w:bookmarkStart w:id="51" w:name="where-the-correction-earns-its-keep"/>
     <w:p>
       <w:pPr>
         <w:pStyle w:val="Heading3"/>
@@ -3777,7 +3924,7 @@
               <w:pStyle w:val="Compact"/>
             </w:pPr>
             <w:r>
-              <w:t xml:space="preserve">Visible</w:t>
+              <w:t xml:space="preserve">Found</w:t>
             </w:r>
           </w:p>
         </w:tc>
@@ -3845,29 +3992,29 @@
               <w:pStyle w:val="Compact"/>
             </w:pPr>
             <w:r>
-              <w:t xml:space="preserve">79%</w:t>
-            </w:r>
-          </w:p>
-        </w:tc>
-        <w:tc>
-          <w:tcPr/>
-          <w:p>
-            <w:pPr>
-              <w:pStyle w:val="Compact"/>
-            </w:pPr>
-            <w:r>
-              <w:t xml:space="preserve">21.4%</w:t>
-            </w:r>
-          </w:p>
-        </w:tc>
-        <w:tc>
-          <w:tcPr/>
-          <w:p>
-            <w:pPr>
-              <w:pStyle w:val="Compact"/>
-            </w:pPr>
-            <w:r>
-              <w:t xml:space="preserve">6.7%</w:t>
+              <w:t xml:space="preserve">57%</w:t>
+            </w:r>
+          </w:p>
+        </w:tc>
+        <w:tc>
+          <w:tcPr/>
+          <w:p>
+            <w:pPr>
+              <w:pStyle w:val="Compact"/>
+            </w:pPr>
+            <w:r>
+              <w:t xml:space="preserve">43.3%</w:t>
+            </w:r>
+          </w:p>
+        </w:tc>
+        <w:tc>
+          <w:tcPr/>
+          <w:p>
+            <w:pPr>
+              <w:pStyle w:val="Compact"/>
+            </w:pPr>
+            <w:r>
+              <w:t xml:space="preserve">11.3%</w:t>
             </w:r>
           </w:p>
         </w:tc>
@@ -3882,7 +4029,7 @@
                 <w:b/>
                 <w:bCs/>
               </w:rPr>
-              <w:t xml:space="preserve">2.5%</w:t>
+              <w:t xml:space="preserve">10.2%</w:t>
             </w:r>
           </w:p>
         </w:tc>
@@ -3917,29 +4064,29 @@
               <w:pStyle w:val="Compact"/>
             </w:pPr>
             <w:r>
-              <w:t xml:space="preserve">90%</w:t>
-            </w:r>
-          </w:p>
-        </w:tc>
-        <w:tc>
-          <w:tcPr/>
-          <w:p>
-            <w:pPr>
-              <w:pStyle w:val="Compact"/>
-            </w:pPr>
-            <w:r>
-              <w:t xml:space="preserve">10.3%</w:t>
-            </w:r>
-          </w:p>
-        </w:tc>
-        <w:tc>
-          <w:tcPr/>
-          <w:p>
-            <w:pPr>
-              <w:pStyle w:val="Compact"/>
-            </w:pPr>
-            <w:r>
-              <w:t xml:space="preserve">2.9%</w:t>
+              <w:t xml:space="preserve">73%</w:t>
+            </w:r>
+          </w:p>
+        </w:tc>
+        <w:tc>
+          <w:tcPr/>
+          <w:p>
+            <w:pPr>
+              <w:pStyle w:val="Compact"/>
+            </w:pPr>
+            <w:r>
+              <w:t xml:space="preserve">26.6%</w:t>
+            </w:r>
+          </w:p>
+        </w:tc>
+        <w:tc>
+          <w:tcPr/>
+          <w:p>
+            <w:pPr>
+              <w:pStyle w:val="Compact"/>
+            </w:pPr>
+            <w:r>
+              <w:t xml:space="preserve">7.0%</w:t>
             </w:r>
           </w:p>
         </w:tc>
@@ -3954,7 +4101,7 @@
                 <w:b/>
                 <w:bCs/>
               </w:rPr>
-              <w:t xml:space="preserve">2.1%</w:t>
+              <w:t xml:space="preserve">4.5%</w:t>
             </w:r>
           </w:p>
         </w:tc>
@@ -3989,29 +4136,29 @@
               <w:pStyle w:val="Compact"/>
             </w:pPr>
             <w:r>
-              <w:t xml:space="preserve">97%</w:t>
-            </w:r>
-          </w:p>
-        </w:tc>
-        <w:tc>
-          <w:tcPr/>
-          <w:p>
-            <w:pPr>
-              <w:pStyle w:val="Compact"/>
-            </w:pPr>
-            <w:r>
-              <w:t xml:space="preserve">2.7%</w:t>
-            </w:r>
-          </w:p>
-        </w:tc>
-        <w:tc>
-          <w:tcPr/>
-          <w:p>
-            <w:pPr>
-              <w:pStyle w:val="Compact"/>
-            </w:pPr>
-            <w:r>
-              <w:t xml:space="preserve">1.0%</w:t>
+              <w:t xml:space="preserve">95%</w:t>
+            </w:r>
+          </w:p>
+        </w:tc>
+        <w:tc>
+          <w:tcPr/>
+          <w:p>
+            <w:pPr>
+              <w:pStyle w:val="Compact"/>
+            </w:pPr>
+            <w:r>
+              <w:t xml:space="preserve">4.8%</w:t>
+            </w:r>
+          </w:p>
+        </w:tc>
+        <w:tc>
+          <w:tcPr/>
+          <w:p>
+            <w:pPr>
+              <w:pStyle w:val="Compact"/>
+            </w:pPr>
+            <w:r>
+              <w:t xml:space="preserve">1.9%</w:t>
             </w:r>
           </w:p>
         </w:tc>
@@ -4026,7 +4173,151 @@
                 <w:b/>
                 <w:bCs/>
               </w:rPr>
-              <w:t xml:space="preserve">0.9%</w:t>
+              <w:t xml:space="preserve">1.4%</w:t>
+            </w:r>
+          </w:p>
+        </w:tc>
+      </w:tr>
+      <w:tr>
+        <w:tc>
+          <w:tcPr/>
+          <w:p>
+            <w:pPr>
+              <w:pStyle w:val="Compact"/>
+            </w:pPr>
+            <w:r>
+              <w:t xml:space="preserve">Open</w:t>
+            </w:r>
+          </w:p>
+        </w:tc>
+        <w:tc>
+          <w:tcPr/>
+          <w:p>
+            <w:pPr>
+              <w:pStyle w:val="Compact"/>
+            </w:pPr>
+            <w:r>
+              <w:t xml:space="preserve">3</w:t>
+            </w:r>
+          </w:p>
+        </w:tc>
+        <w:tc>
+          <w:tcPr/>
+          <w:p>
+            <w:pPr>
+              <w:pStyle w:val="Compact"/>
+            </w:pPr>
+            <w:r>
+              <w:t xml:space="preserve">78%</w:t>
+            </w:r>
+          </w:p>
+        </w:tc>
+        <w:tc>
+          <w:tcPr/>
+          <w:p>
+            <w:pPr>
+              <w:pStyle w:val="Compact"/>
+            </w:pPr>
+            <w:r>
+              <w:t xml:space="preserve">22.2%</w:t>
+            </w:r>
+          </w:p>
+        </w:tc>
+        <w:tc>
+          <w:tcPr/>
+          <w:p>
+            <w:pPr>
+              <w:pStyle w:val="Compact"/>
+            </w:pPr>
+            <w:r>
+              <w:t xml:space="preserve">9.4%</w:t>
+            </w:r>
+          </w:p>
+        </w:tc>
+        <w:tc>
+          <w:tcPr/>
+          <w:p>
+            <w:pPr>
+              <w:pStyle w:val="Compact"/>
+            </w:pPr>
+            <w:r>
+              <w:rPr>
+                <w:b/>
+                <w:bCs/>
+              </w:rPr>
+              <w:t xml:space="preserve">3.8%</w:t>
+            </w:r>
+          </w:p>
+        </w:tc>
+      </w:tr>
+      <w:tr>
+        <w:tc>
+          <w:tcPr/>
+          <w:p>
+            <w:pPr>
+              <w:pStyle w:val="Compact"/>
+            </w:pPr>
+            <w:r>
+              <w:t xml:space="preserve">Open</w:t>
+            </w:r>
+          </w:p>
+        </w:tc>
+        <w:tc>
+          <w:tcPr/>
+          <w:p>
+            <w:pPr>
+              <w:pStyle w:val="Compact"/>
+            </w:pPr>
+            <w:r>
+              <w:t xml:space="preserve">12</w:t>
+            </w:r>
+          </w:p>
+        </w:tc>
+        <w:tc>
+          <w:tcPr/>
+          <w:p>
+            <w:pPr>
+              <w:pStyle w:val="Compact"/>
+            </w:pPr>
+            <w:r>
+              <w:t xml:space="preserve">98%</w:t>
+            </w:r>
+          </w:p>
+        </w:tc>
+        <w:tc>
+          <w:tcPr/>
+          <w:p>
+            <w:pPr>
+              <w:pStyle w:val="Compact"/>
+            </w:pPr>
+            <w:r>
+              <w:t xml:space="preserve">2.3%</w:t>
+            </w:r>
+          </w:p>
+        </w:tc>
+        <w:tc>
+          <w:tcPr/>
+          <w:p>
+            <w:pPr>
+              <w:pStyle w:val="Compact"/>
+            </w:pPr>
+            <w:r>
+              <w:t xml:space="preserve">2.3%</w:t>
+            </w:r>
+          </w:p>
+        </w:tc>
+        <w:tc>
+          <w:tcPr/>
+          <w:p>
+            <w:pPr>
+              <w:pStyle w:val="Compact"/>
+            </w:pPr>
+            <w:r>
+              <w:rPr>
+                <w:b/>
+                <w:bCs/>
+              </w:rPr>
+              <w:t xml:space="preserve">1.0%</w:t>
             </w:r>
           </w:p>
         </w:tc>
@@ -4037,19 +4328,19 @@
         <w:pStyle w:val="BodyText"/>
       </w:pPr>
       <w:r>
-        <w:t xml:space="preserve">On dense canopies at two viewpoints the estimator is 2.7 times more accurate than the multiplier. As</w:t>
-      </w:r>
-      <w:r>
-        <w:t xml:space="preserve"> </w:t>
-      </w:r>
-      <w:r>
-        <w:t xml:space="preserve">the canopy opens and the viewpoints multiply, the advantage narrows, which is what should happen: when</w:t>
-      </w:r>
-      <w:r>
-        <w:t xml:space="preserve"> </w:t>
-      </w:r>
-      <w:r>
-        <w:t xml:space="preserve">almost nothing is hidden there is almost nothing to recover.</w:t>
+        <w:t xml:space="preserve">The advantage holds across canopy density rather than depending on it. What changes with density is</w:t>
+      </w:r>
+      <w:r>
+        <w:t xml:space="preserve"> </w:t>
+      </w:r>
+      <w:r>
+        <w:t xml:space="preserve">how much there is to recover: a dense canopy at two viewpoints hides 43% of its crop from a plain</w:t>
+      </w:r>
+      <w:r>
+        <w:t xml:space="preserve"> </w:t>
+      </w:r>
+      <w:r>
+        <w:t xml:space="preserve">count, an open one at twelve hides 2%.</w:t>
       </w:r>
     </w:p>
     <w:p>
@@ -4061,18 +4352,18 @@
           <wp:inline>
             <wp:extent cx="5334000" cy="2372128"/>
             <wp:effectExtent b="0" l="0" r="0" t="0"/>
-            <wp:docPr descr="Figure 4" title="" id="47" name="Picture"/>
+            <wp:docPr descr="Figure 4" title="" id="49" name="Picture"/>
             <a:graphic>
               <a:graphicData uri="http://schemas.openxmlformats.org/drawingml/2006/picture">
                 <pic:pic>
                   <pic:nvPicPr>
-                    <pic:cNvPr descr="artifacts/figs/fig4_density_bands.png" id="48" name="Picture"/>
+                    <pic:cNvPr descr="artifacts/figs/fig4_density_bands.png" id="50" name="Picture"/>
                     <pic:cNvPicPr>
                       <a:picLocks noChangeArrowheads="1" noChangeAspect="1"/>
                     </pic:cNvPicPr>
                   </pic:nvPicPr>
                   <pic:blipFill>
-                    <a:blip r:embed="rId46"/>
+                    <a:blip r:embed="rId48"/>
                     <a:stretch>
                       <a:fillRect/>
                     </a:stretch>
@@ -4111,14 +4402,14 @@
         <w:t xml:space="preserve">Figure 4. Error by canopy density and viewpoint count.</w:t>
       </w:r>
     </w:p>
-    <w:bookmarkEnd w:id="49"/>
-    <w:bookmarkStart w:id="53" w:name="the-intervals-cover-more-than-they-claim"/>
+    <w:bookmarkEnd w:id="51"/>
+    <w:bookmarkStart w:id="55" w:name="Xb13db10f43707cd7a0853d064e277aa1c6e9b12"/>
     <w:p>
       <w:pPr>
         <w:pStyle w:val="Heading3"/>
       </w:pPr>
       <w:r>
-        <w:t xml:space="preserve">5.6 The intervals cover more than they claim</w:t>
+        <w:t xml:space="preserve">5.6 The estimator depends on the detector, and there is a point where it fails</w:t>
       </w:r>
     </w:p>
     <w:p>
@@ -4126,57 +4417,722 @@
         <w:pStyle w:val="FirstParagraph"/>
       </w:pPr>
       <w:r>
-        <w:t xml:space="preserve">Nominal 90% prediction intervals contained the true count on 98% of trees at two viewpoints and 100%</w:t>
-      </w:r>
-      <w:r>
-        <w:t xml:space="preserve"> </w:t>
-      </w:r>
-      <w:r>
-        <w:t xml:space="preserve">above that, at a width of 17% to 19% of the count. They are conservative rather than</w:t>
-      </w:r>
-      <w:r>
-        <w:t xml:space="preserve"> </w:t>
-      </w:r>
-      <w:r>
-        <w:t xml:space="preserve">under-confident, which is the safer direction for someone deciding how many pickers to hire, and it</w:t>
-      </w:r>
-      <w:r>
-        <w:t xml:space="preserve"> </w:t>
-      </w:r>
-      <w:r>
-        <w:t xml:space="preserve">is still a miscalibration. An earlier version resampled the detected fruit and covered barely half of</w:t>
-      </w:r>
-      <w:r>
-        <w:t xml:space="preserve"> </w:t>
-      </w:r>
-      <w:r>
-        <w:t xml:space="preserve">what it claimed, because resampling fruit varies which fruit a tree happened to grow and almost</w:t>
-      </w:r>
-      <w:r>
-        <w:t xml:space="preserve"> </w:t>
-      </w:r>
-      <w:r>
-        <w:t xml:space="preserve">nothing else, while the uncertainty that dominates is in the fitted detection rate.</w:t>
-      </w:r>
-    </w:p>
+        <w:t xml:space="preserve">The detector is the one part of the pipeline this project does not build, so the conclusion is</w:t>
+      </w:r>
+      <w:r>
+        <w:t xml:space="preserve"> </w:t>
+      </w:r>
+      <w:r>
+        <w:t xml:space="preserve">re-run under a better and a worse one. The result is a boundary rather than a reassurance.</w:t>
+      </w:r>
+    </w:p>
+    <w:tbl>
+      <w:tblPr>
+        <w:tblStyle w:val="Table"/>
+        <w:tblW w:type="pct" w:w="5000"/>
+        <w:tblLayout w:type="fixed"/>
+        <w:tblLook w:firstRow="1" w:lastRow="0" w:firstColumn="0" w:lastColumn="0" w:noHBand="0" w:noVBand="0" w:val="0020"/>
+      </w:tblPr>
+      <w:tblGrid>
+        <w:gridCol w:w="1320"/>
+        <w:gridCol w:w="1320"/>
+        <w:gridCol w:w="1320"/>
+        <w:gridCol w:w="1320"/>
+        <w:gridCol w:w="1320"/>
+        <w:gridCol w:w="1320"/>
+      </w:tblGrid>
+      <w:tr>
+        <w:trPr>
+          <w:tblHeader w:val="on"/>
+        </w:trPr>
+        <w:tc>
+          <w:tcPr/>
+          <w:p>
+            <w:pPr>
+              <w:pStyle w:val="Compact"/>
+            </w:pPr>
+            <w:r>
+              <w:t xml:space="preserve">Detector</w:t>
+            </w:r>
+          </w:p>
+        </w:tc>
+        <w:tc>
+          <w:tcPr/>
+          <w:p>
+            <w:pPr>
+              <w:pStyle w:val="Compact"/>
+            </w:pPr>
+            <w:r>
+              <w:t xml:space="preserve">Viewpoints</w:t>
+            </w:r>
+          </w:p>
+        </w:tc>
+        <w:tc>
+          <w:tcPr/>
+          <w:p>
+            <w:pPr>
+              <w:pStyle w:val="Compact"/>
+            </w:pPr>
+            <w:r>
+              <w:t xml:space="preserve">Found</w:t>
+            </w:r>
+          </w:p>
+        </w:tc>
+        <w:tc>
+          <w:tcPr/>
+          <w:p>
+            <w:pPr>
+              <w:pStyle w:val="Compact"/>
+            </w:pPr>
+            <w:r>
+              <w:t xml:space="preserve">Count what is seen</w:t>
+            </w:r>
+          </w:p>
+        </w:tc>
+        <w:tc>
+          <w:tcPr/>
+          <w:p>
+            <w:pPr>
+              <w:pStyle w:val="Compact"/>
+            </w:pPr>
+            <w:r>
+              <w:t xml:space="preserve">Fitted multiplier</w:t>
+            </w:r>
+          </w:p>
+        </w:tc>
+        <w:tc>
+          <w:tcPr/>
+          <w:p>
+            <w:pPr>
+              <w:pStyle w:val="Compact"/>
+            </w:pPr>
+            <w:r>
+              <w:t xml:space="preserve">Reconstruction</w:t>
+            </w:r>
+          </w:p>
+        </w:tc>
+      </w:tr>
+      <w:tr>
+        <w:tc>
+          <w:tcPr/>
+          <w:p>
+            <w:pPr>
+              <w:pStyle w:val="Compact"/>
+            </w:pPr>
+            <w:r>
+              <w:t xml:space="preserve">Calibrated</w:t>
+            </w:r>
+          </w:p>
+        </w:tc>
+        <w:tc>
+          <w:tcPr/>
+          <w:p>
+            <w:pPr>
+              <w:pStyle w:val="Compact"/>
+            </w:pPr>
+            <w:r>
+              <w:t xml:space="preserve">2</w:t>
+            </w:r>
+          </w:p>
+        </w:tc>
+        <w:tc>
+          <w:tcPr/>
+          <w:p>
+            <w:pPr>
+              <w:pStyle w:val="Compact"/>
+            </w:pPr>
+            <w:r>
+              <w:t xml:space="preserve">60%</w:t>
+            </w:r>
+          </w:p>
+        </w:tc>
+        <w:tc>
+          <w:tcPr/>
+          <w:p>
+            <w:pPr>
+              <w:pStyle w:val="Compact"/>
+            </w:pPr>
+            <w:r>
+              <w:t xml:space="preserve">40.5%</w:t>
+            </w:r>
+          </w:p>
+        </w:tc>
+        <w:tc>
+          <w:tcPr/>
+          <w:p>
+            <w:pPr>
+              <w:pStyle w:val="Compact"/>
+            </w:pPr>
+            <w:r>
+              <w:t xml:space="preserve">11.0%</w:t>
+            </w:r>
+          </w:p>
+        </w:tc>
+        <w:tc>
+          <w:tcPr/>
+          <w:p>
+            <w:pPr>
+              <w:pStyle w:val="Compact"/>
+            </w:pPr>
+            <w:r>
+              <w:rPr>
+                <w:b/>
+                <w:bCs/>
+              </w:rPr>
+              <w:t xml:space="preserve">8.0%</w:t>
+            </w:r>
+          </w:p>
+        </w:tc>
+      </w:tr>
+      <w:tr>
+        <w:tc>
+          <w:tcPr/>
+          <w:p>
+            <w:pPr>
+              <w:pStyle w:val="Compact"/>
+            </w:pPr>
+            <w:r>
+              <w:t xml:space="preserve">Calibrated</w:t>
+            </w:r>
+          </w:p>
+        </w:tc>
+        <w:tc>
+          <w:tcPr/>
+          <w:p>
+            <w:pPr>
+              <w:pStyle w:val="Compact"/>
+            </w:pPr>
+            <w:r>
+              <w:t xml:space="preserve">3</w:t>
+            </w:r>
+          </w:p>
+        </w:tc>
+        <w:tc>
+          <w:tcPr/>
+          <w:p>
+            <w:pPr>
+              <w:pStyle w:val="Compact"/>
+            </w:pPr>
+            <w:r>
+              <w:t xml:space="preserve">74%</w:t>
+            </w:r>
+          </w:p>
+        </w:tc>
+        <w:tc>
+          <w:tcPr/>
+          <w:p>
+            <w:pPr>
+              <w:pStyle w:val="Compact"/>
+            </w:pPr>
+            <w:r>
+              <w:t xml:space="preserve">26.1%</w:t>
+            </w:r>
+          </w:p>
+        </w:tc>
+        <w:tc>
+          <w:tcPr/>
+          <w:p>
+            <w:pPr>
+              <w:pStyle w:val="Compact"/>
+            </w:pPr>
+            <w:r>
+              <w:t xml:space="preserve">8.7%</w:t>
+            </w:r>
+          </w:p>
+        </w:tc>
+        <w:tc>
+          <w:tcPr/>
+          <w:p>
+            <w:pPr>
+              <w:pStyle w:val="Compact"/>
+            </w:pPr>
+            <w:r>
+              <w:rPr>
+                <w:b/>
+                <w:bCs/>
+              </w:rPr>
+              <w:t xml:space="preserve">3.8%</w:t>
+            </w:r>
+          </w:p>
+        </w:tc>
+      </w:tr>
+      <w:tr>
+        <w:tc>
+          <w:tcPr/>
+          <w:p>
+            <w:pPr>
+              <w:pStyle w:val="Compact"/>
+            </w:pPr>
+            <w:r>
+              <w:t xml:space="preserve">Calibrated</w:t>
+            </w:r>
+          </w:p>
+        </w:tc>
+        <w:tc>
+          <w:tcPr/>
+          <w:p>
+            <w:pPr>
+              <w:pStyle w:val="Compact"/>
+            </w:pPr>
+            <w:r>
+              <w:t xml:space="preserve">6</w:t>
+            </w:r>
+          </w:p>
+        </w:tc>
+        <w:tc>
+          <w:tcPr/>
+          <w:p>
+            <w:pPr>
+              <w:pStyle w:val="Compact"/>
+            </w:pPr>
+            <w:r>
+              <w:t xml:space="preserve">91%</w:t>
+            </w:r>
+          </w:p>
+        </w:tc>
+        <w:tc>
+          <w:tcPr/>
+          <w:p>
+            <w:pPr>
+              <w:pStyle w:val="Compact"/>
+            </w:pPr>
+            <w:r>
+              <w:t xml:space="preserve">9.1%</w:t>
+            </w:r>
+          </w:p>
+        </w:tc>
+        <w:tc>
+          <w:tcPr/>
+          <w:p>
+            <w:pPr>
+              <w:pStyle w:val="Compact"/>
+            </w:pPr>
+            <w:r>
+              <w:t xml:space="preserve">2.4%</w:t>
+            </w:r>
+          </w:p>
+        </w:tc>
+        <w:tc>
+          <w:tcPr/>
+          <w:p>
+            <w:pPr>
+              <w:pStyle w:val="Compact"/>
+            </w:pPr>
+            <w:r>
+              <w:rPr>
+                <w:b/>
+                <w:bCs/>
+              </w:rPr>
+              <w:t xml:space="preserve">1.8%</w:t>
+            </w:r>
+          </w:p>
+        </w:tc>
+      </w:tr>
+      <w:tr>
+        <w:tc>
+          <w:tcPr/>
+          <w:p>
+            <w:pPr>
+              <w:pStyle w:val="Compact"/>
+            </w:pPr>
+            <w:r>
+              <w:t xml:space="preserve">Better</w:t>
+            </w:r>
+          </w:p>
+        </w:tc>
+        <w:tc>
+          <w:tcPr/>
+          <w:p>
+            <w:pPr>
+              <w:pStyle w:val="Compact"/>
+            </w:pPr>
+            <w:r>
+              <w:t xml:space="preserve">2</w:t>
+            </w:r>
+          </w:p>
+        </w:tc>
+        <w:tc>
+          <w:tcPr/>
+          <w:p>
+            <w:pPr>
+              <w:pStyle w:val="Compact"/>
+            </w:pPr>
+            <w:r>
+              <w:t xml:space="preserve">82%</w:t>
+            </w:r>
+          </w:p>
+        </w:tc>
+        <w:tc>
+          <w:tcPr/>
+          <w:p>
+            <w:pPr>
+              <w:pStyle w:val="Compact"/>
+            </w:pPr>
+            <w:r>
+              <w:t xml:space="preserve">17.9%</w:t>
+            </w:r>
+          </w:p>
+        </w:tc>
+        <w:tc>
+          <w:tcPr/>
+          <w:p>
+            <w:pPr>
+              <w:pStyle w:val="Compact"/>
+            </w:pPr>
+            <w:r>
+              <w:t xml:space="preserve">6.1%</w:t>
+            </w:r>
+          </w:p>
+        </w:tc>
+        <w:tc>
+          <w:tcPr/>
+          <w:p>
+            <w:pPr>
+              <w:pStyle w:val="Compact"/>
+            </w:pPr>
+            <w:r>
+              <w:rPr>
+                <w:b/>
+                <w:bCs/>
+              </w:rPr>
+              <w:t xml:space="preserve">3.4%</w:t>
+            </w:r>
+          </w:p>
+        </w:tc>
+      </w:tr>
+      <w:tr>
+        <w:tc>
+          <w:tcPr/>
+          <w:p>
+            <w:pPr>
+              <w:pStyle w:val="Compact"/>
+            </w:pPr>
+            <w:r>
+              <w:t xml:space="preserve">Better</w:t>
+            </w:r>
+          </w:p>
+        </w:tc>
+        <w:tc>
+          <w:tcPr/>
+          <w:p>
+            <w:pPr>
+              <w:pStyle w:val="Compact"/>
+            </w:pPr>
+            <w:r>
+              <w:t xml:space="preserve">3</w:t>
+            </w:r>
+          </w:p>
+        </w:tc>
+        <w:tc>
+          <w:tcPr/>
+          <w:p>
+            <w:pPr>
+              <w:pStyle w:val="Compact"/>
+            </w:pPr>
+            <w:r>
+              <w:t xml:space="preserve">92%</w:t>
+            </w:r>
+          </w:p>
+        </w:tc>
+        <w:tc>
+          <w:tcPr/>
+          <w:p>
+            <w:pPr>
+              <w:pStyle w:val="Compact"/>
+            </w:pPr>
+            <w:r>
+              <w:t xml:space="preserve">8.3%</w:t>
+            </w:r>
+          </w:p>
+        </w:tc>
+        <w:tc>
+          <w:tcPr/>
+          <w:p>
+            <w:pPr>
+              <w:pStyle w:val="Compact"/>
+            </w:pPr>
+            <w:r>
+              <w:t xml:space="preserve">3.5%</w:t>
+            </w:r>
+          </w:p>
+        </w:tc>
+        <w:tc>
+          <w:tcPr/>
+          <w:p>
+            <w:pPr>
+              <w:pStyle w:val="Compact"/>
+            </w:pPr>
+            <w:r>
+              <w:rPr>
+                <w:b/>
+                <w:bCs/>
+              </w:rPr>
+              <w:t xml:space="preserve">1.7%</w:t>
+            </w:r>
+          </w:p>
+        </w:tc>
+      </w:tr>
+      <w:tr>
+        <w:tc>
+          <w:tcPr/>
+          <w:p>
+            <w:pPr>
+              <w:pStyle w:val="Compact"/>
+            </w:pPr>
+            <w:r>
+              <w:t xml:space="preserve">Worse</w:t>
+            </w:r>
+          </w:p>
+        </w:tc>
+        <w:tc>
+          <w:tcPr/>
+          <w:p>
+            <w:pPr>
+              <w:pStyle w:val="Compact"/>
+            </w:pPr>
+            <w:r>
+              <w:t xml:space="preserve">2</w:t>
+            </w:r>
+          </w:p>
+        </w:tc>
+        <w:tc>
+          <w:tcPr/>
+          <w:p>
+            <w:pPr>
+              <w:pStyle w:val="Compact"/>
+            </w:pPr>
+            <w:r>
+              <w:t xml:space="preserve">41%</w:t>
+            </w:r>
+          </w:p>
+        </w:tc>
+        <w:tc>
+          <w:tcPr/>
+          <w:p>
+            <w:pPr>
+              <w:pStyle w:val="Compact"/>
+            </w:pPr>
+            <w:r>
+              <w:t xml:space="preserve">58.9%</w:t>
+            </w:r>
+          </w:p>
+        </w:tc>
+        <w:tc>
+          <w:tcPr/>
+          <w:p>
+            <w:pPr>
+              <w:pStyle w:val="Compact"/>
+            </w:pPr>
+            <w:r>
+              <w:rPr>
+                <w:b/>
+                <w:bCs/>
+              </w:rPr>
+              <w:t xml:space="preserve">12.5%</w:t>
+            </w:r>
+          </w:p>
+        </w:tc>
+        <w:tc>
+          <w:tcPr/>
+          <w:p>
+            <w:pPr>
+              <w:pStyle w:val="Compact"/>
+            </w:pPr>
+            <w:r>
+              <w:t xml:space="preserve">21.9%</w:t>
+            </w:r>
+          </w:p>
+        </w:tc>
+      </w:tr>
+      <w:tr>
+        <w:tc>
+          <w:tcPr/>
+          <w:p>
+            <w:pPr>
+              <w:pStyle w:val="Compact"/>
+            </w:pPr>
+            <w:r>
+              <w:t xml:space="preserve">Worse</w:t>
+            </w:r>
+          </w:p>
+        </w:tc>
+        <w:tc>
+          <w:tcPr/>
+          <w:p>
+            <w:pPr>
+              <w:pStyle w:val="Compact"/>
+            </w:pPr>
+            <w:r>
+              <w:t xml:space="preserve">3</w:t>
+            </w:r>
+          </w:p>
+        </w:tc>
+        <w:tc>
+          <w:tcPr/>
+          <w:p>
+            <w:pPr>
+              <w:pStyle w:val="Compact"/>
+            </w:pPr>
+            <w:r>
+              <w:t xml:space="preserve">55%</w:t>
+            </w:r>
+          </w:p>
+        </w:tc>
+        <w:tc>
+          <w:tcPr/>
+          <w:p>
+            <w:pPr>
+              <w:pStyle w:val="Compact"/>
+            </w:pPr>
+            <w:r>
+              <w:t xml:space="preserve">45.5%</w:t>
+            </w:r>
+          </w:p>
+        </w:tc>
+        <w:tc>
+          <w:tcPr/>
+          <w:p>
+            <w:pPr>
+              <w:pStyle w:val="Compact"/>
+            </w:pPr>
+            <w:r>
+              <w:t xml:space="preserve">11.9%</w:t>
+            </w:r>
+          </w:p>
+        </w:tc>
+        <w:tc>
+          <w:tcPr/>
+          <w:p>
+            <w:pPr>
+              <w:pStyle w:val="Compact"/>
+            </w:pPr>
+            <w:r>
+              <w:rPr>
+                <w:b/>
+                <w:bCs/>
+              </w:rPr>
+              <w:t xml:space="preserve">7.3%</w:t>
+            </w:r>
+          </w:p>
+        </w:tc>
+      </w:tr>
+      <w:tr>
+        <w:tc>
+          <w:tcPr/>
+          <w:p>
+            <w:pPr>
+              <w:pStyle w:val="Compact"/>
+            </w:pPr>
+            <w:r>
+              <w:t xml:space="preserve">Worse</w:t>
+            </w:r>
+          </w:p>
+        </w:tc>
+        <w:tc>
+          <w:tcPr/>
+          <w:p>
+            <w:pPr>
+              <w:pStyle w:val="Compact"/>
+            </w:pPr>
+            <w:r>
+              <w:t xml:space="preserve">6</w:t>
+            </w:r>
+          </w:p>
+        </w:tc>
+        <w:tc>
+          <w:tcPr/>
+          <w:p>
+            <w:pPr>
+              <w:pStyle w:val="Compact"/>
+            </w:pPr>
+            <w:r>
+              <w:t xml:space="preserve">78%</w:t>
+            </w:r>
+          </w:p>
+        </w:tc>
+        <w:tc>
+          <w:tcPr/>
+          <w:p>
+            <w:pPr>
+              <w:pStyle w:val="Compact"/>
+            </w:pPr>
+            <w:r>
+              <w:t xml:space="preserve">21.7%</w:t>
+            </w:r>
+          </w:p>
+        </w:tc>
+        <w:tc>
+          <w:tcPr/>
+          <w:p>
+            <w:pPr>
+              <w:pStyle w:val="Compact"/>
+            </w:pPr>
+            <w:r>
+              <w:t xml:space="preserve">5.2%</w:t>
+            </w:r>
+          </w:p>
+        </w:tc>
+        <w:tc>
+          <w:tcPr/>
+          <w:p>
+            <w:pPr>
+              <w:pStyle w:val="Compact"/>
+            </w:pPr>
+            <w:r>
+              <w:rPr>
+                <w:b/>
+                <w:bCs/>
+              </w:rPr>
+              <w:t xml:space="preserve">3.4%</w:t>
+            </w:r>
+          </w:p>
+        </w:tc>
+      </w:tr>
+    </w:tbl>
     <w:p>
       <w:pPr>
         <w:pStyle w:val="BodyText"/>
       </w:pPr>
       <w:r>
-        <w:t xml:space="preserve">I have not narrowed the intervals to hit 90%, because the only trees available to narrow them against</w:t>
-      </w:r>
-      <w:r>
-        <w:t xml:space="preserve"> </w:t>
-      </w:r>
-      <w:r>
-        <w:t xml:space="preserve">are the trees the estimator is scored on, and fitting the interval to the test set would make the</w:t>
-      </w:r>
-      <w:r>
-        <w:t xml:space="preserve"> </w:t>
-      </w:r>
-      <w:r>
-        <w:t xml:space="preserve">coverage figure meaningless. Calibrating width on a separate set is the next piece of work.</w:t>
+        <w:t xml:space="preserve">With a poor detector and only two viewpoints the estimator loses, and loses badly: 21.9% against the</w:t>
+      </w:r>
+      <w:r>
+        <w:t xml:space="preserve"> </w:t>
+      </w:r>
+      <w:r>
+        <w:t xml:space="preserve">multiplier’s 12.5%. That combination leaves it fitting a detection model to histories that are both</w:t>
+      </w:r>
+      <w:r>
+        <w:t xml:space="preserve"> </w:t>
+      </w:r>
+      <w:r>
+        <w:t xml:space="preserve">short and mostly empty, and a wrong model applied confidently is worse than a blunt constant applied</w:t>
+      </w:r>
+      <w:r>
+        <w:t xml:space="preserve"> </w:t>
+      </w:r>
+      <w:r>
+        <w:t xml:space="preserve">cautiously. Three viewpoints are enough to recover the advantage even with the poor detector, and</w:t>
+      </w:r>
+      <w:r>
+        <w:t xml:space="preserve"> </w:t>
+      </w:r>
+      <w:r>
+        <w:t xml:space="preserve">six restore it fully.</w:t>
+      </w:r>
+    </w:p>
+    <w:p>
+      <w:pPr>
+        <w:pStyle w:val="BodyText"/>
+      </w:pPr>
+      <w:r>
+        <w:t xml:space="preserve">This is the practical limit of the method as it stands, and it is a specific and checkable one: do</w:t>
+      </w:r>
+      <w:r>
+        <w:t xml:space="preserve"> </w:t>
+      </w:r>
+      <w:r>
+        <w:t xml:space="preserve">not use it on two viewpoints unless the detector is known to be good.</w:t>
       </w:r>
     </w:p>
     <w:p>
@@ -4186,20 +5142,20 @@
       <w:r>
         <w:drawing>
           <wp:inline>
-            <wp:extent cx="5334000" cy="3162017"/>
+            <wp:extent cx="5334000" cy="2320720"/>
             <wp:effectExtent b="0" l="0" r="0" t="0"/>
-            <wp:docPr descr="Figure 7" title="" id="51" name="Picture"/>
+            <wp:docPr descr="Figure 8" title="" id="53" name="Picture"/>
             <a:graphic>
               <a:graphicData uri="http://schemas.openxmlformats.org/drawingml/2006/picture">
                 <pic:pic>
                   <pic:nvPicPr>
-                    <pic:cNvPr descr="artifacts/figs/fig7_interval_coverage.png" id="52" name="Picture"/>
+                    <pic:cNvPr descr="artifacts/figs/fig8_detector_sensitivity.png" id="54" name="Picture"/>
                     <pic:cNvPicPr>
                       <a:picLocks noChangeArrowheads="1" noChangeAspect="1"/>
                     </pic:cNvPicPr>
                   </pic:nvPicPr>
                   <pic:blipFill>
-                    <a:blip r:embed="rId50"/>
+                    <a:blip r:embed="rId52"/>
                     <a:stretch>
                       <a:fillRect/>
                     </a:stretch>
@@ -4207,7 +5163,7 @@
                   <pic:spPr bwMode="auto">
                     <a:xfrm>
                       <a:off x="0" y="0"/>
-                      <a:ext cx="5334000" cy="3162017"/>
+                      <a:ext cx="5334000" cy="2320720"/>
                     </a:xfrm>
                     <a:prstGeom prst="rect">
                       <a:avLst/>
@@ -4235,17 +5191,31 @@
           <w:i/>
           <w:iCs/>
         </w:rPr>
-        <w:t xml:space="preserve">Figure 7. Coverage achieved against coverage claimed, with interval width.</w:t>
-      </w:r>
-    </w:p>
-    <w:bookmarkEnd w:id="53"/>
-    <w:bookmarkStart w:id="54" w:name="the-objectives-revisited"/>
+        <w:t xml:space="preserve">Figure 8. The comparison under three detectors. The estimator’s advantage holds everywhere except</w:t>
+      </w:r>
+      <w:r>
+        <w:rPr>
+          <w:i/>
+          <w:iCs/>
+        </w:rPr>
+        <w:t xml:space="preserve"> </w:t>
+      </w:r>
+      <w:r>
+        <w:rPr>
+          <w:i/>
+          <w:iCs/>
+        </w:rPr>
+        <w:t xml:space="preserve">the poor detector at two viewpoints.</w:t>
+      </w:r>
+    </w:p>
+    <w:bookmarkEnd w:id="55"/>
+    <w:bookmarkStart w:id="59" w:name="X646d311da662008a6fd5ac88f6cdcf8b10e8c91"/>
     <w:p>
       <w:pPr>
         <w:pStyle w:val="Heading3"/>
       </w:pPr>
       <w:r>
-        <w:t xml:space="preserve">5.7 The objectives, revisited</w:t>
+        <w:t xml:space="preserve">5.7 The intervals, before and after calibration</w:t>
       </w:r>
     </w:p>
     <w:p>
@@ -4253,37 +5223,164 @@
         <w:pStyle w:val="FirstParagraph"/>
       </w:pPr>
       <w:r>
+        <w:t xml:space="preserve">Raw prediction intervals from the parametric bootstrap cover 88% of trees at two viewpoints against</w:t>
+      </w:r>
+      <w:r>
+        <w:t xml:space="preserve"> </w:t>
+      </w:r>
+      <w:r>
+        <w:t xml:space="preserve">a claimed 90%, which is close, and then drift upward to 100% at four viewpoints and above, which is</w:t>
+      </w:r>
+      <w:r>
+        <w:t xml:space="preserve"> </w:t>
+      </w:r>
+      <w:r>
+        <w:t xml:space="preserve">conservative. Rescaling by a multiplier fitted on the twenty calibration trees brings the middle of</w:t>
+      </w:r>
+      <w:r>
+        <w:t xml:space="preserve"> </w:t>
+      </w:r>
+      <w:r>
+        <w:t xml:space="preserve">the range to where it claims to be, 90% at three viewpoints and 95% at six, and narrows the interval</w:t>
+      </w:r>
+      <w:r>
+        <w:t xml:space="preserve"> </w:t>
+      </w:r>
+      <w:r>
+        <w:t xml:space="preserve">from 23% of the count to 17% at three viewpoints and from 17% to 6% at twelve.</w:t>
+      </w:r>
+    </w:p>
+    <w:p>
+      <w:pPr>
+        <w:pStyle w:val="BodyText"/>
+      </w:pPr>
+      <w:r>
+        <w:t xml:space="preserve">It does not work everywhere. At four viewpoints the correction overshoots and coverage falls to 80%,</w:t>
+      </w:r>
+      <w:r>
+        <w:t xml:space="preserve"> </w:t>
+      </w:r>
+      <w:r>
+        <w:t xml:space="preserve">below what it claims, and at two viewpoints it pushes an already reasonable 88% up to 98%. Twenty</w:t>
+      </w:r>
+      <w:r>
+        <w:t xml:space="preserve"> </w:t>
+      </w:r>
+      <w:r>
+        <w:t xml:space="preserve">trees are too few to fit a stable multiplier, and the honest reading is that the calibration works in</w:t>
+      </w:r>
+      <w:r>
+        <w:t xml:space="preserve"> </w:t>
+      </w:r>
+      <w:r>
+        <w:t xml:space="preserve">the middle of the range and is noisy at its edges. Both series are reported for that reason.</w:t>
+      </w:r>
+    </w:p>
+    <w:p>
+      <w:pPr>
+        <w:pStyle w:val="BodyText"/>
+      </w:pPr>
+      <w:r>
+        <w:drawing>
+          <wp:inline>
+            <wp:extent cx="5334000" cy="2656798"/>
+            <wp:effectExtent b="0" l="0" r="0" t="0"/>
+            <wp:docPr descr="Figure 7" title="" id="57" name="Picture"/>
+            <a:graphic>
+              <a:graphicData uri="http://schemas.openxmlformats.org/drawingml/2006/picture">
+                <pic:pic>
+                  <pic:nvPicPr>
+                    <pic:cNvPr descr="artifacts/figs/fig7_interval_coverage.png" id="58" name="Picture"/>
+                    <pic:cNvPicPr>
+                      <a:picLocks noChangeArrowheads="1" noChangeAspect="1"/>
+                    </pic:cNvPicPr>
+                  </pic:nvPicPr>
+                  <pic:blipFill>
+                    <a:blip r:embed="rId56"/>
+                    <a:stretch>
+                      <a:fillRect/>
+                    </a:stretch>
+                  </pic:blipFill>
+                  <pic:spPr bwMode="auto">
+                    <a:xfrm>
+                      <a:off x="0" y="0"/>
+                      <a:ext cx="5334000" cy="2656798"/>
+                    </a:xfrm>
+                    <a:prstGeom prst="rect">
+                      <a:avLst/>
+                    </a:prstGeom>
+                    <a:noFill/>
+                    <a:ln w="9525">
+                      <a:noFill/>
+                      <a:headEnd/>
+                      <a:tailEnd/>
+                    </a:ln>
+                  </pic:spPr>
+                </pic:pic>
+              </a:graphicData>
+            </a:graphic>
+          </wp:inline>
+        </w:drawing>
+      </w:r>
+    </w:p>
+    <w:p>
+      <w:pPr>
+        <w:pStyle w:val="BodyText"/>
+      </w:pPr>
+      <w:r>
+        <w:rPr>
+          <w:i/>
+          <w:iCs/>
+        </w:rPr>
+        <w:t xml:space="preserve">Figure 7. Coverage and width, before and after calibration, against the 90% claimed.</w:t>
+      </w:r>
+    </w:p>
+    <w:bookmarkEnd w:id="59"/>
+    <w:bookmarkStart w:id="60" w:name="the-objectives-revisited"/>
+    <w:p>
+      <w:pPr>
+        <w:pStyle w:val="Heading3"/>
+      </w:pPr>
+      <w:r>
+        <w:t xml:space="preserve">5.8 The objectives, revisited</w:t>
+      </w:r>
+    </w:p>
+    <w:p>
+      <w:pPr>
+        <w:pStyle w:val="FirstParagraph"/>
+      </w:pPr>
+      <w:r>
         <w:t xml:space="preserve">The simulator reproduces the transmittance law it is built from, checked against the closed form in</w:t>
       </w:r>
       <w:r>
         <w:t xml:space="preserve"> </w:t>
       </w:r>
       <w:r>
-        <w:t xml:space="preserve">the test suite, and its one-viewpoint visible fraction brackets the published field measurement,</w:t>
-      </w:r>
-      <w:r>
-        <w:t xml:space="preserve"> </w:t>
-      </w:r>
-      <w:r>
-        <w:t xml:space="preserve">though its two-viewpoint figure remains optimistic. The estimator returns a total and an interval.</w:t>
-      </w:r>
-      <w:r>
-        <w:t xml:space="preserve"> </w:t>
-      </w:r>
-      <w:r>
-        <w:t xml:space="preserve">Using the reconstruction beats the smooth canopy-depth proxy it replaced at every viewpoint count,</w:t>
-      </w:r>
-      <w:r>
-        <w:t xml:space="preserve"> </w:t>
-      </w:r>
-      <w:r>
-        <w:t xml:space="preserve">by roughly a factor of two at two viewpoints. Every method was scored on identical trees from</w:t>
-      </w:r>
-      <w:r>
-        <w:t xml:space="preserve"> </w:t>
-      </w:r>
-      <w:r>
-        <w:t xml:space="preserve">identical detections.</w:t>
+        <w:t xml:space="preserve">the test suite. Its fruit-found fractions now bracket both published field figures, and the</w:t>
+      </w:r>
+      <w:r>
+        <w:t xml:space="preserve"> </w:t>
+      </w:r>
+      <w:r>
+        <w:t xml:space="preserve">correction factors it demands span the range measured across real orchards. The estimator returns a</w:t>
+      </w:r>
+      <w:r>
+        <w:t xml:space="preserve"> </w:t>
+      </w:r>
+      <w:r>
+        <w:t xml:space="preserve">total and an interval. Using the reconstruction beats the smooth canopy-depth proxy it replaced at</w:t>
+      </w:r>
+      <w:r>
+        <w:t xml:space="preserve"> </w:t>
+      </w:r>
+      <w:r>
+        <w:t xml:space="preserve">every viewpoint count, by more than a factor of two at two viewpoints. Every method was scored on</w:t>
+      </w:r>
+      <w:r>
+        <w:t xml:space="preserve"> </w:t>
+      </w:r>
+      <w:r>
+        <w:t xml:space="preserve">identical trees from identical detections.</w:t>
       </w:r>
     </w:p>
     <w:p>
@@ -4307,9 +5404,9 @@
         </w:pict>
       </w:r>
     </w:p>
-    <w:bookmarkEnd w:id="54"/>
-    <w:bookmarkEnd w:id="55"/>
-    <w:bookmarkStart w:id="61" w:name="discussion"/>
+    <w:bookmarkEnd w:id="60"/>
+    <w:bookmarkEnd w:id="61"/>
+    <w:bookmarkStart w:id="67" w:name="discussion"/>
     <w:p>
       <w:pPr>
         <w:pStyle w:val="Heading2"/>
@@ -4318,7 +5415,7 @@
         <w:t xml:space="preserve">6. Discussion</w:t>
       </w:r>
     </w:p>
-    <w:bookmarkStart w:id="56" w:name="the-answer-to-the-question-i-asked"/>
+    <w:bookmarkStart w:id="62" w:name="the-answer-to-the-question-i-asked"/>
     <w:p>
       <w:pPr>
         <w:pStyle w:val="Heading3"/>
@@ -4338,13 +5435,13 @@
         <w:t xml:space="preserve"> </w:t>
       </w:r>
       <w:r>
-        <w:t xml:space="preserve">between two and three times more accurate than the fitted multiplier the field uses, and needs no</w:t>
-      </w:r>
-      <w:r>
-        <w:t xml:space="preserve"> </w:t>
-      </w:r>
-      <w:r>
-        <w:t xml:space="preserve">harvested trees to calibrate against, which is the practical difference: a multiplier has to be</w:t>
+        <w:t xml:space="preserve">about twice as accurate as the fitted multiplier the field uses across most of the range, and needs</w:t>
+      </w:r>
+      <w:r>
+        <w:t xml:space="preserve"> </w:t>
+      </w:r>
+      <w:r>
+        <w:t xml:space="preserve">no harvested trees to calibrate against, which is the practical difference: a multiplier has to be</w:t>
       </w:r>
       <w:r>
         <w:t xml:space="preserve"> </w:t>
@@ -4358,6 +5455,26 @@
         <w:pStyle w:val="BodyText"/>
       </w:pPr>
       <w:r>
+        <w:t xml:space="preserve">It is not uniformly better. On two viewpoints with a poor detector the multiplier wins, and by a</w:t>
+      </w:r>
+      <w:r>
+        <w:t xml:space="preserve"> </w:t>
+      </w:r>
+      <w:r>
+        <w:t xml:space="preserve">wide margin. The method needs enough sightings to fit a detection model, and where it does not have</w:t>
+      </w:r>
+      <w:r>
+        <w:t xml:space="preserve"> </w:t>
+      </w:r>
+      <w:r>
+        <w:t xml:space="preserve">them a confident wrong model is worse than a blunt constant.</w:t>
+      </w:r>
+    </w:p>
+    <w:p>
+      <w:pPr>
+        <w:pStyle w:val="BodyText"/>
+      </w:pPr>
+      <w:r>
         <w:t xml:space="preserve">The claim is bounded in a specific way. It is measured on simulated trees whose occlusion the</w:t>
       </w:r>
       <w:r>
@@ -4367,8 +5484,8 @@
         <w:t xml:space="preserve">previous section shows to be milder than a real hedgerow. It is not yet a claim about Alphonso.</w:t>
       </w:r>
     </w:p>
-    <w:bookmarkEnd w:id="56"/>
-    <w:bookmarkStart w:id="57" w:name="what-produced-the-result"/>
+    <w:bookmarkEnd w:id="62"/>
+    <w:bookmarkStart w:id="63" w:name="what-produced-the-result"/>
     <w:p>
       <w:pPr>
         <w:pStyle w:val="Heading3"/>
@@ -4420,17 +5537,17 @@
         <w:t xml:space="preserve"> </w:t>
       </w:r>
       <w:r>
-        <w:t xml:space="preserve">are. Chao’s estimator, which uses the sighting distribution alone, reaches 28.3% error at two</w:t>
-      </w:r>
-      <w:r>
-        <w:t xml:space="preserve"> </w:t>
-      </w:r>
-      <w:r>
-        <w:t xml:space="preserve">viewpoints where the split estimator reaches 2.3%.</w:t>
-      </w:r>
-    </w:p>
-    <w:bookmarkEnd w:id="57"/>
-    <w:bookmarkStart w:id="58" w:name="where-it-sits-against-the-field"/>
+        <w:t xml:space="preserve">are. Chao’s estimator, which uses the sighting distribution alone, reaches 68.2% error at two</w:t>
+      </w:r>
+      <w:r>
+        <w:t xml:space="preserve"> </w:t>
+      </w:r>
+      <w:r>
+        <w:t xml:space="preserve">viewpoints where the split estimator reaches 9.5%.</w:t>
+      </w:r>
+    </w:p>
+    <w:bookmarkEnd w:id="63"/>
+    <w:bookmarkStart w:id="64" w:name="where-it-sits-against-the-field"/>
     <w:p>
       <w:pPr>
         <w:pStyle w:val="Heading3"/>
@@ -4503,8 +5620,8 @@
         <w:t xml:space="preserve">removes that dependence in principle. Whether it does so in practice is a harvest away.</w:t>
       </w:r>
     </w:p>
-    <w:bookmarkEnd w:id="58"/>
-    <w:bookmarkStart w:id="59" w:name="creative-decisions-named"/>
+    <w:bookmarkEnd w:id="64"/>
+    <w:bookmarkStart w:id="65" w:name="creative-decisions-named"/>
     <w:p>
       <w:pPr>
         <w:pStyle w:val="Heading3"/>
@@ -4567,8 +5684,8 @@
         <w:t xml:space="preserve">than presence.</w:t>
       </w:r>
     </w:p>
-    <w:bookmarkEnd w:id="59"/>
-    <w:bookmarkStart w:id="60" w:name="limitations"/>
+    <w:bookmarkEnd w:id="65"/>
+    <w:bookmarkStart w:id="66" w:name="limitations"/>
     <w:p>
       <w:pPr>
         <w:pStyle w:val="Heading3"/>
@@ -4582,31 +5699,73 @@
         <w:pStyle w:val="FirstParagraph"/>
       </w:pPr>
       <w:r>
-        <w:t xml:space="preserve">The results are simulated. The simulator is easier than a hedgerow, by an amount Section 4.3</w:t>
-      </w:r>
-      <w:r>
-        <w:t xml:space="preserve"> </w:t>
-      </w:r>
-      <w:r>
-        <w:t xml:space="preserve">quantifies. The intervals are conservative and not yet calibrated on separate trees. Fruit detection</w:t>
-      </w:r>
-      <w:r>
-        <w:t xml:space="preserve"> </w:t>
-      </w:r>
-      <w:r>
-        <w:t xml:space="preserve">itself is assumed rather than performed, at a fixed reliability of 0.95, and a real detector on real</w:t>
-      </w:r>
-      <w:r>
-        <w:t xml:space="preserve"> </w:t>
-      </w:r>
-      <w:r>
-        <w:t xml:space="preserve">images at speed will do worse. Fruit positions are assumed recoverable in three dimensions, which</w:t>
-      </w:r>
-      <w:r>
-        <w:t xml:space="preserve"> </w:t>
-      </w:r>
-      <w:r>
-        <w:t xml:space="preserve">photogrammetry does under good conditions and less well in wind or poor light.</w:t>
+        <w:t xml:space="preserve">The results are simulated. The simulator is calibrated against published field measurements rather</w:t>
+      </w:r>
+      <w:r>
+        <w:t xml:space="preserve"> </w:t>
+      </w:r>
+      <w:r>
+        <w:t xml:space="preserve">than validated against my own, and it represents a free-standing tree scanned on foot rather than a</w:t>
+      </w:r>
+      <w:r>
+        <w:t xml:space="preserve"> </w:t>
+      </w:r>
+      <w:r>
+        <w:t xml:space="preserve">hedgerow imaged from a vehicle.</w:t>
+      </w:r>
+    </w:p>
+    <w:p>
+      <w:pPr>
+        <w:pStyle w:val="BodyText"/>
+      </w:pPr>
+      <w:r>
+        <w:t xml:space="preserve">The intervals are calibrated on twenty trees, which is too few to be stable, and the correction</w:t>
+      </w:r>
+      <w:r>
+        <w:t xml:space="preserve"> </w:t>
+      </w:r>
+      <w:r>
+        <w:t xml:space="preserve">misses at two of the five viewpoint counts.</w:t>
+      </w:r>
+    </w:p>
+    <w:p>
+      <w:pPr>
+        <w:pStyle w:val="BodyText"/>
+      </w:pPr>
+      <w:r>
+        <w:t xml:space="preserve">Fruit detection is modelled rather than performed. The model is anchored to published detector</w:t>
+      </w:r>
+      <w:r>
+        <w:t xml:space="preserve"> </w:t>
+      </w:r>
+      <w:r>
+        <w:t xml:space="preserve">performance, and the conclusion is checked against a better and a worse detector, but no detector</w:t>
+      </w:r>
+      <w:r>
+        <w:t xml:space="preserve"> </w:t>
+      </w:r>
+      <w:r>
+        <w:t xml:space="preserve">was run on an image in this work.</w:t>
+      </w:r>
+    </w:p>
+    <w:p>
+      <w:pPr>
+        <w:pStyle w:val="BodyText"/>
+      </w:pPr>
+      <w:r>
+        <w:t xml:space="preserve">Fruit positions are assumed recoverable in three dimensions, which photogrammetry does under good</w:t>
+      </w:r>
+      <w:r>
+        <w:t xml:space="preserve"> </w:t>
+      </w:r>
+      <w:r>
+        <w:t xml:space="preserve">conditions and less well in wind or poor light. That assumption is untested here and is the one I</w:t>
+      </w:r>
+      <w:r>
+        <w:t xml:space="preserve"> </w:t>
+      </w:r>
+      <w:r>
+        <w:t xml:space="preserve">would attack first.</w:t>
       </w:r>
     </w:p>
     <w:p>
@@ -4616,9 +5775,9 @@
         </w:pict>
       </w:r>
     </w:p>
-    <w:bookmarkEnd w:id="60"/>
-    <w:bookmarkEnd w:id="61"/>
-    <w:bookmarkStart w:id="62" w:name="ethics-and-responsible-use"/>
+    <w:bookmarkEnd w:id="66"/>
+    <w:bookmarkEnd w:id="67"/>
+    <w:bookmarkStart w:id="68" w:name="ethics-and-responsible-use"/>
     <w:p>
       <w:pPr>
         <w:pStyle w:val="Heading2"/>
@@ -4808,8 +5967,8 @@
         </w:pict>
       </w:r>
     </w:p>
-    <w:bookmarkEnd w:id="62"/>
-    <w:bookmarkStart w:id="63" w:name="reflection-and-next-steps"/>
+    <w:bookmarkEnd w:id="68"/>
+    <w:bookmarkStart w:id="69" w:name="reflection-and-next-steps"/>
     <w:p>
       <w:pPr>
         <w:pStyle w:val="Heading2"/>
@@ -4971,8 +6130,8 @@
         </w:pict>
       </w:r>
     </w:p>
-    <w:bookmarkEnd w:id="63"/>
-    <w:bookmarkStart w:id="64" w:name="a-note-on-ai-use"/>
+    <w:bookmarkEnd w:id="69"/>
+    <w:bookmarkStart w:id="70" w:name="a-note-on-ai-use"/>
     <w:p>
       <w:pPr>
         <w:pStyle w:val="Heading2"/>
@@ -5194,8 +6353,8 @@
         </w:pict>
       </w:r>
     </w:p>
-    <w:bookmarkEnd w:id="64"/>
-    <w:bookmarkStart w:id="65" w:name="references"/>
+    <w:bookmarkEnd w:id="70"/>
+    <w:bookmarkStart w:id="71" w:name="references"/>
     <w:p>
       <w:pPr>
         <w:pStyle w:val="Heading2"/>
@@ -5742,8 +6901,8 @@
         </w:pict>
       </w:r>
     </w:p>
-    <w:bookmarkEnd w:id="65"/>
-    <w:bookmarkStart w:id="66" w:name="appendix-a-glossary"/>
+    <w:bookmarkEnd w:id="71"/>
+    <w:bookmarkStart w:id="72" w:name="appendix-a-glossary"/>
     <w:p>
       <w:pPr>
         <w:pStyle w:val="Heading2"/>
@@ -6007,8 +7166,8 @@
         </w:tc>
       </w:tr>
     </w:tbl>
-    <w:bookmarkEnd w:id="66"/>
-    <w:bookmarkStart w:id="67" w:name="X348114da13462a2ddc03c9c60071a5d5a3ae91a"/>
+    <w:bookmarkEnd w:id="72"/>
+    <w:bookmarkStart w:id="73" w:name="X348114da13462a2ddc03c9c60071a5d5a3ae91a"/>
     <w:p>
       <w:pPr>
         <w:pStyle w:val="Heading2"/>
@@ -6251,8 +7410,8 @@
         <w:t xml:space="preserve">, amended by appending only.</w:t>
       </w:r>
     </w:p>
-    <w:bookmarkEnd w:id="67"/>
-    <w:bookmarkStart w:id="68" w:name="appendix-c-the-mathematics"/>
+    <w:bookmarkEnd w:id="73"/>
+    <w:bookmarkStart w:id="74" w:name="appendix-c-the-mathematics"/>
     <w:p>
       <w:pPr>
         <w:pStyle w:val="Heading2"/>
@@ -7771,8 +8930,8 @@
         <w:t xml:space="preserve">End of draft.</w:t>
       </w:r>
     </w:p>
-    <w:bookmarkEnd w:id="68"/>
-    <w:bookmarkEnd w:id="69"/>
+    <w:bookmarkEnd w:id="74"/>
+    <w:bookmarkEnd w:id="75"/>
     <w:sectPr>
       <w:footnotePr>
         <w:numRestart w:val="eachSect"/>

</xml_diff>

<commit_message>
Move the detector-sensitivity legend clear of the tallest bar
</commit_message>
<xml_diff>
--- a/aamganak/CREST_REPORT.docx
+++ b/aamganak/CREST_REPORT.docx
@@ -5142,7 +5142,7 @@
       <w:r>
         <w:drawing>
           <wp:inline>
-            <wp:extent cx="5334000" cy="2320720"/>
+            <wp:extent cx="5334000" cy="2565912"/>
             <wp:effectExtent b="0" l="0" r="0" t="0"/>
             <wp:docPr descr="Figure 8" title="" id="53" name="Picture"/>
             <a:graphic>
@@ -5163,7 +5163,7 @@
                   <pic:spPr bwMode="auto">
                     <a:xfrm>
                       <a:off x="0" y="0"/>
-                      <a:ext cx="5334000" cy="2320720"/>
+                      <a:ext cx="5334000" cy="2565912"/>
                     </a:xfrm>
                     <a:prstGeom prst="rect">
                       <a:avLst/>

</xml_diff>

<commit_message>
Interval calibration: the fix failed, and the failure is the finding
</commit_message>
<xml_diff>
--- a/aamganak/CREST_REPORT.docx
+++ b/aamganak/CREST_REPORT.docx
@@ -510,25 +510,31 @@
         <w:pStyle w:val="BodyText"/>
       </w:pPr>
       <w:r>
-        <w:t xml:space="preserve">India grows more mango than any other country, on the order of 22 million tonnes a year, and about</w:t>
-      </w:r>
-      <w:r>
-        <w:t xml:space="preserve"> </w:t>
-      </w:r>
-      <w:r>
-        <w:t xml:space="preserve">85% of that fruit comes from holdings under two hectares [7]. For a grower on that scale the fruit</w:t>
-      </w:r>
-      <w:r>
-        <w:t xml:space="preserve"> </w:t>
-      </w:r>
-      <w:r>
-        <w:t xml:space="preserve">count per tree is the number that everything else is planned around, and almost none of them have</w:t>
-      </w:r>
-      <w:r>
-        <w:t xml:space="preserve"> </w:t>
-      </w:r>
-      <w:r>
-        <w:t xml:space="preserve">it.</w:t>
+        <w:t xml:space="preserve">India grows more mango than any other country, around 22 million tonnes in 2023 to 2024 [7], and</w:t>
+      </w:r>
+      <w:r>
+        <w:t xml:space="preserve"> </w:t>
+      </w:r>
+      <w:r>
+        <w:t xml:space="preserve">86% of the country’s farm holdings are under two hectares, working between them a little under half</w:t>
+      </w:r>
+      <w:r>
+        <w:t xml:space="preserve"> </w:t>
+      </w:r>
+      <w:r>
+        <w:t xml:space="preserve">the cultivated area [14]. Most of the people growing this crop are therefore working at a scale</w:t>
+      </w:r>
+      <w:r>
+        <w:t xml:space="preserve"> </w:t>
+      </w:r>
+      <w:r>
+        <w:t xml:space="preserve">where the fruit count per tree is the number everything else is planned around, and almost none of</w:t>
+      </w:r>
+      <w:r>
+        <w:t xml:space="preserve"> </w:t>
+      </w:r>
+      <w:r>
+        <w:t xml:space="preserve">them have it.</w:t>
       </w:r>
     </w:p>
     <w:p>
@@ -870,6 +876,32 @@
       </w:pPr>
       <w:r>
         <w:t xml:space="preserve">1.3 How the project has run</w:t>
+      </w:r>
+    </w:p>
+    <w:p>
+      <w:pPr>
+        <w:pStyle w:val="FirstParagraph"/>
+      </w:pPr>
+      <w:r>
+        <w:t xml:space="preserve">This is the third attempt at the same question. I have been trying to put a number in a Konkan</w:t>
+      </w:r>
+      <w:r>
+        <w:t xml:space="preserve"> </w:t>
+      </w:r>
+      <w:r>
+        <w:t xml:space="preserve">grower’s hands since June, and the first two attempts are the reason this one takes the shape it</w:t>
+      </w:r>
+      <w:r>
+        <w:t xml:space="preserve"> </w:t>
+      </w:r>
+      <w:r>
+        <w:t xml:space="preserve">does. Every date below comes from the commit history of the repository, which is public and can be</w:t>
+      </w:r>
+      <w:r>
+        <w:t xml:space="preserve"> </w:t>
+      </w:r>
+      <w:r>
+        <w:t xml:space="preserve">checked.</w:t>
       </w:r>
     </w:p>
     <w:tbl>
@@ -917,7 +949,7 @@
               <w:pStyle w:val="Compact"/>
             </w:pPr>
             <w:r>
-              <w:t xml:space="preserve">Note</w:t>
+              <w:t xml:space="preserve">What happened</w:t>
             </w:r>
           </w:p>
         </w:tc>
@@ -930,29 +962,29 @@
               <w:pStyle w:val="Compact"/>
             </w:pPr>
             <w:r>
-              <w:t xml:space="preserve">1. Aim, objectives and success conditions fixed before any code</w:t>
-            </w:r>
-          </w:p>
-        </w:tc>
-        <w:tc>
-          <w:tcPr/>
-          <w:p>
-            <w:pPr>
-              <w:pStyle w:val="Compact"/>
-            </w:pPr>
-            <w:r>
-              <w:t xml:space="preserve">3 Sep 2026</w:t>
-            </w:r>
-          </w:p>
-        </w:tc>
-        <w:tc>
-          <w:tcPr/>
-          <w:p>
-            <w:pPr>
-              <w:pStyle w:val="Compact"/>
-            </w:pPr>
-            <w:r>
-              <w:t xml:space="preserve">Written down first and amended since only by appending.</w:t>
+              <w:t xml:space="preserve">1. First attempt: an advisory system assembled from public data feeds</w:t>
+            </w:r>
+          </w:p>
+        </w:tc>
+        <w:tc>
+          <w:tcPr/>
+          <w:p>
+            <w:pPr>
+              <w:pStyle w:val="Compact"/>
+            </w:pPr>
+            <w:r>
+              <w:t xml:space="preserve">8-12 Jun 2026</w:t>
+            </w:r>
+          </w:p>
+        </w:tc>
+        <w:tc>
+          <w:tcPr/>
+          <w:p>
+            <w:pPr>
+              <w:pStyle w:val="Compact"/>
+            </w:pPr>
+            <w:r>
+              <w:t xml:space="preserve">Connectors for mandi prices, agrometeorological bulletins, satellite vegetation indices and pest surveillance, with a first report draft. Abandoned: it combined other people’s measurements and produced none of its own, so there was nothing in it I could test.</w:t>
             </w:r>
           </w:p>
         </w:tc>
@@ -965,29 +997,29 @@
               <w:pStyle w:val="Compact"/>
             </w:pPr>
             <w:r>
-              <w:t xml:space="preserve">2. Canopy simulator and detection model</w:t>
-            </w:r>
-          </w:p>
-        </w:tc>
-        <w:tc>
-          <w:tcPr/>
-          <w:p>
-            <w:pPr>
-              <w:pStyle w:val="Compact"/>
-            </w:pPr>
-            <w:r>
-              <w:t xml:space="preserve">3 Sep 2026</w:t>
-            </w:r>
-          </w:p>
-        </w:tc>
-        <w:tc>
-          <w:tcPr/>
-          <w:p>
-            <w:pPr>
-              <w:pStyle w:val="Compact"/>
-            </w:pPr>
-            <w:r>
-              <w:t xml:space="preserve">Three defects in the physics found and fixed during this stage.</w:t>
+              <w:t xml:space="preserve">2. Second attempt: a low-cost near-infrared meter for dry matter</w:t>
+            </w:r>
+          </w:p>
+        </w:tc>
+        <w:tc>
+          <w:tcPr/>
+          <w:p>
+            <w:pPr>
+              <w:pStyle w:val="Compact"/>
+            </w:pPr>
+            <w:r>
+              <w:t xml:space="preserve">22 Jun - 12 Jul 2026</w:t>
+            </w:r>
+          </w:p>
+        </w:tc>
+        <w:tc>
+          <w:tcPr/>
+          <w:p>
+            <w:pPr>
+              <w:pStyle w:val="Compact"/>
+            </w:pPr>
+            <w:r>
+              <w:t xml:space="preserve">Wavelength selection on a public benchmark of 11,691 fruit, an eight-wavelength design, firmware and a build guide. The wavelength result held up. Abandoned: every claim about the instrument depended on hardware I had not built, so the central number could not be validated by me.</w:t>
             </w:r>
           </w:p>
         </w:tc>
@@ -1000,29 +1032,29 @@
               <w:pStyle w:val="Compact"/>
             </w:pPr>
             <w:r>
-              <w:t xml:space="preserve">3. Estimators and the viewpoint study</w:t>
-            </w:r>
-          </w:p>
-        </w:tc>
-        <w:tc>
-          <w:tcPr/>
-          <w:p>
-            <w:pPr>
-              <w:pStyle w:val="Compact"/>
-            </w:pPr>
-            <w:r>
-              <w:t xml:space="preserve">3 Sep 2026</w:t>
-            </w:r>
-          </w:p>
-        </w:tc>
-        <w:tc>
-          <w:tcPr/>
-          <w:p>
-            <w:pPr>
-              <w:pStyle w:val="Compact"/>
-            </w:pPr>
-            <w:r>
-              <w:t xml:space="preserve">The corrected simulator contradicted my original framing; the aim narrowed.</w:t>
+              <w:t xml:space="preserve">3. Examination period</w:t>
+            </w:r>
+          </w:p>
+        </w:tc>
+        <w:tc>
+          <w:tcPr/>
+          <w:p>
+            <w:pPr>
+              <w:pStyle w:val="Compact"/>
+            </w:pPr>
+            <w:r>
+              <w:t xml:space="preserve">mid-Jul - end Aug 2026</w:t>
+            </w:r>
+          </w:p>
+        </w:tc>
+        <w:tc>
+          <w:tcPr/>
+          <w:p>
+            <w:pPr>
+              <w:pStyle w:val="Compact"/>
+            </w:pPr>
+            <w:r>
+              <w:t xml:space="preserve">No project work. Planned.</w:t>
             </w:r>
           </w:p>
         </w:tc>
@@ -1035,29 +1067,29 @@
               <w:pStyle w:val="Compact"/>
             </w:pPr>
             <w:r>
-              <w:t xml:space="preserve">4. Reconstruction module and the estimator built on it</w:t>
-            </w:r>
-          </w:p>
-        </w:tc>
-        <w:tc>
-          <w:tcPr/>
-          <w:p>
-            <w:pPr>
-              <w:pStyle w:val="Compact"/>
-            </w:pPr>
-            <w:r>
-              <w:t xml:space="preserve">3–4 Sep 2026</w:t>
-            </w:r>
-          </w:p>
-        </w:tc>
-        <w:tc>
-          <w:tcPr/>
-          <w:p>
-            <w:pPr>
-              <w:pStyle w:val="Compact"/>
-            </w:pPr>
-            <w:r>
-              <w:t xml:space="preserve">Replaced a smooth proxy that was barely helping.</w:t>
+              <w:t xml:space="preserve">4. Third attempt: counting fruit a camera cannot see</w:t>
+            </w:r>
+          </w:p>
+        </w:tc>
+        <w:tc>
+          <w:tcPr/>
+          <w:p>
+            <w:pPr>
+              <w:pStyle w:val="Compact"/>
+            </w:pPr>
+            <w:r>
+              <w:t xml:space="preserve">3 Sep 2026</w:t>
+            </w:r>
+          </w:p>
+        </w:tc>
+        <w:tc>
+          <w:tcPr/>
+          <w:p>
+            <w:pPr>
+              <w:pStyle w:val="Compact"/>
+            </w:pPr>
+            <w:r>
+              <w:t xml:space="preserve">Aim, objectives and success conditions fixed before any code. Canopy simulator built; three defects in its physics found and fixed the same day.</w:t>
             </w:r>
           </w:p>
         </w:tc>
@@ -1070,29 +1102,29 @@
               <w:pStyle w:val="Compact"/>
             </w:pPr>
             <w:r>
-              <w:t xml:space="preserve">5. Calibration against published field counts</w:t>
-            </w:r>
-          </w:p>
-        </w:tc>
-        <w:tc>
-          <w:tcPr/>
-          <w:p>
-            <w:pPr>
-              <w:pStyle w:val="Compact"/>
-            </w:pPr>
-            <w:r>
-              <w:t xml:space="preserve">4 Sep 2026</w:t>
-            </w:r>
-          </w:p>
-        </w:tc>
-        <w:tc>
-          <w:tcPr/>
-          <w:p>
-            <w:pPr>
-              <w:pStyle w:val="Compact"/>
-            </w:pPr>
-            <w:r>
-              <w:t xml:space="preserve">Identified a missing occluder. Parameters reset to physical values.</w:t>
+              <w:t xml:space="preserve">5. Estimators and the viewpoint study</w:t>
+            </w:r>
+          </w:p>
+        </w:tc>
+        <w:tc>
+          <w:tcPr/>
+          <w:p>
+            <w:pPr>
+              <w:pStyle w:val="Compact"/>
+            </w:pPr>
+            <w:r>
+              <w:t xml:space="preserve">3 Sep 2026</w:t>
+            </w:r>
+          </w:p>
+        </w:tc>
+        <w:tc>
+          <w:tcPr/>
+          <w:p>
+            <w:pPr>
+              <w:pStyle w:val="Compact"/>
+            </w:pPr>
+            <w:r>
+              <w:t xml:space="preserve">The corrected simulator contradicted the premise I had started from, and the aim narrowed in response.</w:t>
             </w:r>
           </w:p>
         </w:tc>
@@ -1105,27 +1137,30 @@
               <w:pStyle w:val="Compact"/>
             </w:pPr>
             <w:r>
-              <w:t xml:space="preserve">6. Figures and this draft</w:t>
-            </w:r>
-          </w:p>
-        </w:tc>
-        <w:tc>
-          <w:tcPr/>
-          <w:p>
-            <w:pPr>
-              <w:pStyle w:val="Compact"/>
-            </w:pPr>
-            <w:r>
-              <w:t xml:space="preserve">4 Sep 2026</w:t>
-            </w:r>
-          </w:p>
-        </w:tc>
-        <w:tc>
-          <w:tcPr/>
-          <w:p>
-            <w:pPr>
-              <w:pStyle w:val="Compact"/>
-            </w:pPr>
+              <w:t xml:space="preserve">6. Reconstruction module and the estimator built on it</w:t>
+            </w:r>
+          </w:p>
+        </w:tc>
+        <w:tc>
+          <w:tcPr/>
+          <w:p>
+            <w:pPr>
+              <w:pStyle w:val="Compact"/>
+            </w:pPr>
+            <w:r>
+              <w:t xml:space="preserve">3-4 Sep 2026</w:t>
+            </w:r>
+          </w:p>
+        </w:tc>
+        <w:tc>
+          <w:tcPr/>
+          <w:p>
+            <w:pPr>
+              <w:pStyle w:val="Compact"/>
+            </w:pPr>
+            <w:r>
+              <w:t xml:space="preserve">Replaced a smooth proxy that was barely improving on classical methods.</w:t>
+            </w:r>
           </w:p>
         </w:tc>
       </w:tr>
@@ -1137,7 +1172,77 @@
               <w:pStyle w:val="Compact"/>
             </w:pPr>
             <w:r>
-              <w:t xml:space="preserve">7.</w:t>
+              <w:t xml:space="preserve">7. Calibration against published field counts</w:t>
+            </w:r>
+          </w:p>
+        </w:tc>
+        <w:tc>
+          <w:tcPr/>
+          <w:p>
+            <w:pPr>
+              <w:pStyle w:val="Compact"/>
+            </w:pPr>
+            <w:r>
+              <w:t xml:space="preserve">4 Sep 2026</w:t>
+            </w:r>
+          </w:p>
+        </w:tc>
+        <w:tc>
+          <w:tcPr/>
+          <w:p>
+            <w:pPr>
+              <w:pStyle w:val="Compact"/>
+            </w:pPr>
+            <w:r>
+              <w:t xml:space="preserve">Identified a missing occluder and reset the canopy parameters to physical values.</w:t>
+            </w:r>
+          </w:p>
+        </w:tc>
+      </w:tr>
+      <w:tr>
+        <w:tc>
+          <w:tcPr/>
+          <w:p>
+            <w:pPr>
+              <w:pStyle w:val="Compact"/>
+            </w:pPr>
+            <w:r>
+              <w:t xml:space="preserve">8. Detector model, interval calibration, figures, this draft</w:t>
+            </w:r>
+          </w:p>
+        </w:tc>
+        <w:tc>
+          <w:tcPr/>
+          <w:p>
+            <w:pPr>
+              <w:pStyle w:val="Compact"/>
+            </w:pPr>
+            <w:r>
+              <w:t xml:space="preserve">4 Sep 2026</w:t>
+            </w:r>
+          </w:p>
+        </w:tc>
+        <w:tc>
+          <w:tcPr/>
+          <w:p>
+            <w:pPr>
+              <w:pStyle w:val="Compact"/>
+            </w:pPr>
+            <w:r>
+              <w:t xml:space="preserve">Found the setting where the method fails, by testing it against a worse detector.</w:t>
+            </w:r>
+          </w:p>
+        </w:tc>
+      </w:tr>
+      <w:tr>
+        <w:tc>
+          <w:tcPr/>
+          <w:p>
+            <w:pPr>
+              <w:pStyle w:val="Compact"/>
+            </w:pPr>
+            <w:r>
+              <w:t xml:space="preserve">9.</w:t>
             </w:r>
             <w:r>
               <w:t xml:space="preserve"> </w:t>
@@ -1153,27 +1258,30 @@
               <w:t xml:space="preserve"> </w:t>
             </w:r>
             <w:r>
-              <w:t xml:space="preserve">detection pipeline on public orchard images</w:t>
-            </w:r>
-          </w:p>
-        </w:tc>
-        <w:tc>
-          <w:tcPr/>
-          <w:p>
-            <w:pPr>
-              <w:pStyle w:val="Compact"/>
-            </w:pPr>
-            <w:r>
-              <w:t xml:space="preserve">Oct–Dec 2026</w:t>
-            </w:r>
-          </w:p>
-        </w:tc>
-        <w:tc>
-          <w:tcPr/>
-          <w:p>
-            <w:pPr>
-              <w:pStyle w:val="Compact"/>
-            </w:pPr>
+              <w:t xml:space="preserve">fruit detector run on public orchard images</w:t>
+            </w:r>
+          </w:p>
+        </w:tc>
+        <w:tc>
+          <w:tcPr/>
+          <w:p>
+            <w:pPr>
+              <w:pStyle w:val="Compact"/>
+            </w:pPr>
+            <w:r>
+              <w:t xml:space="preserve">Oct - Dec 2026</w:t>
+            </w:r>
+          </w:p>
+        </w:tc>
+        <w:tc>
+          <w:tcPr/>
+          <w:p>
+            <w:pPr>
+              <w:pStyle w:val="Compact"/>
+            </w:pPr>
+            <w:r>
+              <w:t xml:space="preserve">To replace a modelled detector with a measured one.</w:t>
+            </w:r>
           </w:p>
         </w:tc>
       </w:tr>
@@ -1185,7 +1293,7 @@
               <w:pStyle w:val="Compact"/>
             </w:pPr>
             <w:r>
-              <w:t xml:space="preserve">8.</w:t>
+              <w:t xml:space="preserve">10.</w:t>
             </w:r>
             <w:r>
               <w:t xml:space="preserve"> </w:t>
@@ -1201,27 +1309,30 @@
               <w:t xml:space="preserve"> </w:t>
             </w:r>
             <w:r>
-              <w:t xml:space="preserve">interval calibration on held-out trees</w:t>
-            </w:r>
-          </w:p>
-        </w:tc>
-        <w:tc>
-          <w:tcPr/>
-          <w:p>
-            <w:pPr>
-              <w:pStyle w:val="Compact"/>
-            </w:pPr>
-            <w:r>
-              <w:t xml:space="preserve">Jan 2027</w:t>
-            </w:r>
-          </w:p>
-        </w:tc>
-        <w:tc>
-          <w:tcPr/>
-          <w:p>
-            <w:pPr>
-              <w:pStyle w:val="Compact"/>
-            </w:pPr>
+              <w:t xml:space="preserve">orchard campaign, scan then pick and count</w:t>
+            </w:r>
+          </w:p>
+        </w:tc>
+        <w:tc>
+          <w:tcPr/>
+          <w:p>
+            <w:pPr>
+              <w:pStyle w:val="Compact"/>
+            </w:pPr>
+            <w:r>
+              <w:t xml:space="preserve">Feb - May 2027</w:t>
+            </w:r>
+          </w:p>
+        </w:tc>
+        <w:tc>
+          <w:tcPr/>
+          <w:p>
+            <w:pPr>
+              <w:pStyle w:val="Compact"/>
+            </w:pPr>
+            <w:r>
+              <w:t xml:space="preserve">Constrained by the fruiting season. Nothing can substitute for it.</w:t>
+            </w:r>
           </w:p>
         </w:tc>
       </w:tr>
@@ -1233,7 +1344,7 @@
               <w:pStyle w:val="Compact"/>
             </w:pPr>
             <w:r>
-              <w:t xml:space="preserve">9.</w:t>
+              <w:t xml:space="preserve">11.</w:t>
             </w:r>
             <w:r>
               <w:t xml:space="preserve"> </w:t>
@@ -1249,57 +1360,6 @@
               <w:t xml:space="preserve"> </w:t>
             </w:r>
             <w:r>
-              <w:t xml:space="preserve">orchard campaign, scan then pick and count</w:t>
-            </w:r>
-          </w:p>
-        </w:tc>
-        <w:tc>
-          <w:tcPr/>
-          <w:p>
-            <w:pPr>
-              <w:pStyle w:val="Compact"/>
-            </w:pPr>
-            <w:r>
-              <w:t xml:space="preserve">Feb–May 2027</w:t>
-            </w:r>
-          </w:p>
-        </w:tc>
-        <w:tc>
-          <w:tcPr/>
-          <w:p>
-            <w:pPr>
-              <w:pStyle w:val="Compact"/>
-            </w:pPr>
-            <w:r>
-              <w:t xml:space="preserve">Constrained by the fruiting season.</w:t>
-            </w:r>
-          </w:p>
-        </w:tc>
-      </w:tr>
-      <w:tr>
-        <w:tc>
-          <w:tcPr/>
-          <w:p>
-            <w:pPr>
-              <w:pStyle w:val="Compact"/>
-            </w:pPr>
-            <w:r>
-              <w:t xml:space="preserve">10.</w:t>
-            </w:r>
-            <w:r>
-              <w:t xml:space="preserve"> </w:t>
-            </w:r>
-            <w:r>
-              <w:rPr>
-                <w:i/>
-                <w:iCs/>
-              </w:rPr>
-              <w:t xml:space="preserve">Planned:</w:t>
-            </w:r>
-            <w:r>
-              <w:t xml:space="preserve"> </w:t>
-            </w:r>
-            <w:r>
               <w:t xml:space="preserve">final analysis and submission</w:t>
             </w:r>
           </w:p>
@@ -1311,7 +1371,7 @@
               <w:pStyle w:val="Compact"/>
             </w:pPr>
             <w:r>
-              <w:t xml:space="preserve">Jun–Jul 2027</w:t>
+              <w:t xml:space="preserve">Jun - Jul 2027</w:t>
             </w:r>
           </w:p>
         </w:tc>
@@ -1330,13 +1390,31 @@
         <w:pStyle w:val="BodyText"/>
       </w:pPr>
       <w:r>
-        <w:t xml:space="preserve">Stages 7 to 10 have not happened and are marked as plans. The dates for stages 1 to 6 come from the</w:t>
-      </w:r>
-      <w:r>
-        <w:t xml:space="preserve"> </w:t>
-      </w:r>
-      <w:r>
-        <w:t xml:space="preserve">commit history of the repository, not from memory.</w:t>
+        <w:t xml:space="preserve">Two things are worth saying about that table rather than leaving them to be inferred. The first is</w:t>
+      </w:r>
+      <w:r>
+        <w:t xml:space="preserve"> </w:t>
+      </w:r>
+      <w:r>
+        <w:t xml:space="preserve">that stages 4 to 8 are compressed into two days, which is unusual and is the direct result of the</w:t>
+      </w:r>
+      <w:r>
+        <w:t xml:space="preserve"> </w:t>
+      </w:r>
+      <w:r>
+        <w:t xml:space="preserve">two attempts before them: the dataset, the evaluation discipline and the reason for caring about</w:t>
+      </w:r>
+      <w:r>
+        <w:t xml:space="preserve"> </w:t>
+      </w:r>
+      <w:r>
+        <w:t xml:space="preserve">occlusion all came out of stage 2. The second is that stages 9 to 11 have not happened. They are</w:t>
+      </w:r>
+      <w:r>
+        <w:t xml:space="preserve"> </w:t>
+      </w:r>
+      <w:r>
+        <w:t xml:space="preserve">marked as plans, and the work is not finished until they have.</w:t>
       </w:r>
     </w:p>
     <w:p>
@@ -5209,13 +5287,13 @@
       </w:r>
     </w:p>
     <w:bookmarkEnd w:id="55"/>
-    <w:bookmarkStart w:id="59" w:name="X646d311da662008a6fd5ac88f6cdcf8b10e8c91"/>
+    <w:bookmarkStart w:id="59" w:name="X7715c72f4ece8dcdf334617c23dad07c8a32ed0"/>
     <w:p>
       <w:pPr>
         <w:pStyle w:val="Heading3"/>
       </w:pPr>
       <w:r>
-        <w:t xml:space="preserve">5.7 The intervals, before and after calibration</w:t>
+        <w:t xml:space="preserve">5.7 The intervals, and a correction that did not work</w:t>
       </w:r>
     </w:p>
     <w:p>
@@ -5235,19 +5313,7 @@
         <w:t xml:space="preserve"> </w:t>
       </w:r>
       <w:r>
-        <w:t xml:space="preserve">conservative. Rescaling by a multiplier fitted on the twenty calibration trees brings the middle of</w:t>
-      </w:r>
-      <w:r>
-        <w:t xml:space="preserve"> </w:t>
-      </w:r>
-      <w:r>
-        <w:t xml:space="preserve">the range to where it claims to be, 90% at three viewpoints and 95% at six, and narrows the interval</w:t>
-      </w:r>
-      <w:r>
-        <w:t xml:space="preserve"> </w:t>
-      </w:r>
-      <w:r>
-        <w:t xml:space="preserve">from 23% of the count to 17% at three viewpoints and from 17% to 6% at twelve.</w:t>
+        <w:t xml:space="preserve">conservative rather than wrong but is still not what the interval says.</w:t>
       </w:r>
     </w:p>
     <w:p>
@@ -5255,25 +5321,89 @@
         <w:pStyle w:val="BodyText"/>
       </w:pPr>
       <w:r>
-        <w:t xml:space="preserve">It does not work everywhere. At four viewpoints the correction overshoots and coverage falls to 80%,</w:t>
-      </w:r>
-      <w:r>
-        <w:t xml:space="preserve"> </w:t>
-      </w:r>
-      <w:r>
-        <w:t xml:space="preserve">below what it claims, and at two viewpoints it pushes an already reasonable 88% up to 98%. Twenty</w:t>
-      </w:r>
-      <w:r>
-        <w:t xml:space="preserve"> </w:t>
-      </w:r>
-      <w:r>
-        <w:t xml:space="preserve">trees are too few to fit a stable multiplier, and the honest reading is that the calibration works in</w:t>
-      </w:r>
-      <w:r>
-        <w:t xml:space="preserve"> </w:t>
-      </w:r>
-      <w:r>
-        <w:t xml:space="preserve">the middle of the range and is noisy at its edges. Both series are reported for that reason.</w:t>
+        <w:t xml:space="preserve">I rescaled them by a multiplier fitted on fifty trees held back for that purpose, and the result is</w:t>
+      </w:r>
+      <w:r>
+        <w:t xml:space="preserve"> </w:t>
+      </w:r>
+      <w:r>
+        <w:t xml:space="preserve">mixed. At three, six and twelve viewpoints the coverage lands where it should, at 90%, 93% and 92%,</w:t>
+      </w:r>
+      <w:r>
+        <w:t xml:space="preserve"> </w:t>
+      </w:r>
+      <w:r>
+        <w:t xml:space="preserve">and the interval narrows from 23% of the count to 17% at three viewpoints and from 17% to 5% at</w:t>
+      </w:r>
+      <w:r>
+        <w:t xml:space="preserve"> </w:t>
+      </w:r>
+      <w:r>
+        <w:t xml:space="preserve">twelve. At four viewpoints the correction overshoots and coverage falls to 80%, below what it claims.</w:t>
+      </w:r>
+      <w:r>
+        <w:t xml:space="preserve"> </w:t>
+      </w:r>
+      <w:r>
+        <w:t xml:space="preserve">At two viewpoints it takes an already reasonable 88% and pushes it to 100%.</w:t>
+      </w:r>
+    </w:p>
+    <w:p>
+      <w:pPr>
+        <w:pStyle w:val="BodyText"/>
+      </w:pPr>
+      <w:r>
+        <w:t xml:space="preserve">My first explanation was that the multiplier was fitted on too few trees. That turned out to be</w:t>
+      </w:r>
+      <w:r>
+        <w:t xml:space="preserve"> </w:t>
+      </w:r>
+      <w:r>
+        <w:t xml:space="preserve">wrong, and the way I know is that I tested it: tripling the calibration set from twenty trees to</w:t>
+      </w:r>
+      <w:r>
+        <w:t xml:space="preserve"> </w:t>
+      </w:r>
+      <w:r>
+        <w:t xml:space="preserve">fifty moved the multipliers by almost nothing, from 1.259 to 1.309 at two viewpoints and from 0.511</w:t>
+      </w:r>
+      <w:r>
+        <w:t xml:space="preserve"> </w:t>
+      </w:r>
+      <w:r>
+        <w:t xml:space="preserve">to 0.509 at four. A quantity that does not move when its sample triples is not the noisy part. The</w:t>
+      </w:r>
+      <w:r>
+        <w:t xml:space="preserve"> </w:t>
+      </w:r>
+      <w:r>
+        <w:t xml:space="preserve">correction is the wrong shape rather than imprecise, because one number per viewpoint count cannot</w:t>
+      </w:r>
+      <w:r>
+        <w:t xml:space="preserve"> </w:t>
+      </w:r>
+      <w:r>
+        <w:t xml:space="preserve">repair an interval that is miscalibrated by different amounts on different trees. Making it depend on</w:t>
+      </w:r>
+      <w:r>
+        <w:t xml:space="preserve"> </w:t>
+      </w:r>
+      <w:r>
+        <w:t xml:space="preserve">how much of each canopy went unobserved is the next thing to try.</w:t>
+      </w:r>
+    </w:p>
+    <w:p>
+      <w:pPr>
+        <w:pStyle w:val="BodyText"/>
+      </w:pPr>
+      <w:r>
+        <w:t xml:space="preserve">Both series are reported for that reason, and a grower using this today should use the uncalibrated</w:t>
+      </w:r>
+      <w:r>
+        <w:t xml:space="preserve"> </w:t>
+      </w:r>
+      <w:r>
+        <w:t xml:space="preserve">interval, which is conservative everywhere and close to correct at the protocols that matter.</w:t>
       </w:r>
     </w:p>
     <w:p>
@@ -6626,7 +6756,7 @@
         </w:numPr>
       </w:pPr>
       <w:r>
-        <w:t xml:space="preserve">National Horticulture Board (2023)</w:t>
+        <w:t xml:space="preserve">Ministry of Agriculture and Farmers Welfare (2024)</w:t>
       </w:r>
       <w:r>
         <w:t xml:space="preserve"> </w:t>
@@ -6636,16 +6766,30 @@
           <w:i/>
           <w:iCs/>
         </w:rPr>
-        <w:t xml:space="preserve">Horticultural Statistics at a Glance</w:t>
-      </w:r>
-      <w:r>
-        <w:t xml:space="preserve">. Ministry of Agriculture</w:t>
-      </w:r>
-      <w:r>
-        <w:t xml:space="preserve"> </w:t>
-      </w:r>
-      <w:r>
-        <w:t xml:space="preserve">and Farmers Welfare, Government of India.</w:t>
+        <w:t xml:space="preserve">Final Estimates of 2022-23 and First Advance</w:t>
+      </w:r>
+      <w:r>
+        <w:rPr>
+          <w:i/>
+          <w:iCs/>
+        </w:rPr>
+        <w:t xml:space="preserve"> </w:t>
+      </w:r>
+      <w:r>
+        <w:rPr>
+          <w:i/>
+          <w:iCs/>
+        </w:rPr>
+        <w:t xml:space="preserve">Estimates of 2023-24 of Area and Production of Horticultural Crops</w:t>
+      </w:r>
+      <w:r>
+        <w:t xml:space="preserve">. Press Information Bureau,</w:t>
+      </w:r>
+      <w:r>
+        <w:t xml:space="preserve"> </w:t>
+      </w:r>
+      <w:r>
+        <w:t xml:space="preserve">Government of India.</w:t>
       </w:r>
     </w:p>
     <w:p>
@@ -6790,7 +6934,7 @@
         <w:t xml:space="preserve">Agricultural and Forest Meteorology</w:t>
       </w:r>
       <w:r>
-        <w:t xml:space="preserve">, 60(3), pp. 249-266.</w:t>
+        <w:t xml:space="preserve">, 60, pp. 249-266.</w:t>
       </w:r>
     </w:p>
     <w:p>
@@ -6861,7 +7005,46 @@
         <w:t xml:space="preserve">Wildlife Monographs</w:t>
       </w:r>
       <w:r>
-        <w:t xml:space="preserve">, 62, pp. 3-135.</w:t>
+        <w:t xml:space="preserve">, 62, pp. 1-135.</w:t>
+      </w:r>
+    </w:p>
+    <w:p>
+      <w:pPr>
+        <w:pStyle w:val="Compact"/>
+        <w:numPr>
+          <w:ilvl w:val="0"/>
+          <w:numId w:val="1003"/>
+        </w:numPr>
+      </w:pPr>
+      <w:r>
+        <w:t xml:space="preserve">Ministry of Agriculture and Farmers Welfare (2018)</w:t>
+      </w:r>
+      <w:r>
+        <w:t xml:space="preserve"> </w:t>
+      </w:r>
+      <w:r>
+        <w:rPr>
+          <w:i/>
+          <w:iCs/>
+        </w:rPr>
+        <w:t xml:space="preserve">All India Report on Agriculture Census</w:t>
+      </w:r>
+      <w:r>
+        <w:rPr>
+          <w:i/>
+          <w:iCs/>
+        </w:rPr>
+        <w:t xml:space="preserve"> </w:t>
+      </w:r>
+      <w:r>
+        <w:rPr>
+          <w:i/>
+          <w:iCs/>
+        </w:rPr>
+        <w:t xml:space="preserve">2015-16</w:t>
+      </w:r>
+      <w:r>
+        <w:t xml:space="preserve">. Government of India.</w:t>
       </w:r>
     </w:p>
     <w:p>
@@ -6885,13 +7068,19 @@
         <w:t xml:space="preserve"> </w:t>
       </w:r>
       <w:r>
-        <w:t xml:space="preserve">them. The rest support single technical points, and their bibliographic details need checking</w:t>
-      </w:r>
-      <w:r>
-        <w:t xml:space="preserve"> </w:t>
-      </w:r>
-      <w:r>
-        <w:t xml:space="preserve">against the originals before submission. That check is outstanding and this is a draft.</w:t>
+        <w:t xml:space="preserve">them. Every entry’s bibliographic details have been checked against the original record. That</w:t>
+      </w:r>
+      <w:r>
+        <w:t xml:space="preserve"> </w:t>
+      </w:r>
+      <w:r>
+        <w:t xml:space="preserve">check corrected two page ranges and replaced the source behind the production and smallholding</w:t>
+      </w:r>
+      <w:r>
+        <w:t xml:space="preserve"> </w:t>
+      </w:r>
+      <w:r>
+        <w:t xml:space="preserve">figures, which had been attributed to a publication that does not carry them.</w:t>
       </w:r>
     </w:p>
     <w:p>

</xml_diff>

<commit_message>
Make the three-attempt structure explicit in the timeline accounts
The dates and facts are unchanged. Section 1.3 and the profile form's 1.5
note now state what the table implies: one question ran through all three
attempts, each attempt changed the instrument rather than the question, and
each abandonment was forced by a stated measurement failure. The official
form docx is re-synced from the same content.
</commit_message>
<xml_diff>
--- a/aamganak/CREST_REPORT.docx
+++ b/aamganak/CREST_REPORT.docx
@@ -1151,7 +1151,31 @@
         <w:pStyle w:val="BodyText"/>
       </w:pPr>
       <w:r>
-        <w:t xml:space="preserve">Two things are worth saying about that table rather than leaving them to be inferred. The first is that stages 4 to 7 are compressed into two days, which is unusual and is the direct result of the two attempts before them: the dataset, the evaluation discipline and the reason for caring about occlusion all came out of stage 2. The second is that stages 8 to 10 have not happened. They are marked as plans, and the work is not finished until they have.</w:t>
+        <w:t xml:space="preserve">Three things are worth saying about that table rather than leaving them to be inferred.</w:t>
+      </w:r>
+    </w:p>
+    <w:p>
+      <w:pPr>
+        <w:pStyle w:val="BodyText"/>
+      </w:pPr>
+      <w:r>
+        <w:t xml:space="preserve">First, the question never changed. Every stage from June onward serves the same aim, putting a trustworthy crop estimate in a smallholder’s hands. What changed between attempts was the instrument, and each change was forced by a specific measurement rather than by a shift of interest: attempt 1 was abandoned because it produced none of its own measurements, and attempt 2 because every claim rested on hardware I had not built. The two abandonments are what made the third attempt’s discipline — fix the evaluation before writing code, refuse numbers the data cannot support — into habits rather than intentions.</w:t>
+      </w:r>
+    </w:p>
+    <w:p>
+      <w:pPr>
+        <w:pStyle w:val="BodyText"/>
+      </w:pPr>
+      <w:r>
+        <w:t xml:space="preserve">Second, stages 4 to 7 are compressed into two days, which is unusual, and the compression is the direct result of the two attempts before them: the dataset, the evaluation discipline and the reason for caring about occlusion all came out of stage 2.</w:t>
+      </w:r>
+    </w:p>
+    <w:p>
+      <w:pPr>
+        <w:pStyle w:val="BodyText"/>
+      </w:pPr>
+      <w:r>
+        <w:t xml:space="preserve">Third, stages 8 to 10 have not happened. They are marked as plans, and the work is not finished until they have.</w:t>
       </w:r>
     </w:p>
     <w:p>

</xml_diff>

<commit_message>
Scrutiny round: reference every figure, fix the study script's crash, disclose run cost
All eight figures are now referred to in the text before they appear. The
reproduce script's summary block read a metrics key that no longer exists and
would have crashed after writing its output. Appendix B now states the Beta
fruit placement, the Monte Carlo sample count, the bootstrap replicate count,
the shell count behind the estimator, and that a full reproduce run costs
tens of minutes of CPU. The detector settings are named as they are labelled
in the code.
</commit_message>
<xml_diff>
--- a/aamganak/CREST_REPORT.docx
+++ b/aamganak/CREST_REPORT.docx
@@ -742,7 +742,7 @@
               <w:pStyle w:val="Compact"/>
             </w:pPr>
             <w:r>
-              <w:t xml:space="preserve">2. Second attempt: low-cost NIR meter for dry matter</w:t>
+              <w:t xml:space="preserve">2. Second attempt: low-cost near-infrared (NIR) meter for dry matter</w:t>
             </w:r>
           </w:p>
         </w:tc>
@@ -1958,7 +1958,7 @@
         <w:pStyle w:val="BodyText"/>
       </w:pPr>
       <w:r>
-        <w:t xml:space="preserve">I am reporting that as a calibration of the whole pipeline rather than as a measurement of a detector, because the two are not the same thing. Their figure counts detections against a harvest, so it includes fruit no camera was ever pointed at, high in the tree or on the far side of a row, while my cameras see the whole tree. The calibrated setting may be standing in for losses this model does not represent. That is why the study re-runs its comparison under a better detector and a worse one, so the conclusion can be checked against the setting rather than resting on it.</w:t>
+        <w:t xml:space="preserve">I am reporting that as a calibration of the whole pipeline rather than as a measurement of a detector, because the two are not the same thing. Their figure counts detections against a harvest, so it includes fruit no camera was ever pointed at, high in the tree or on the far side of a row, while my cameras see the whole tree. The calibrated setting may be standing in for losses this model does not represent. That is why the study re-runs its comparison under a better detector and a worse one, so the conclusion can be checked against the setting rather than resting on it. Figure 2 puts the simulator’s visible and never-visible fractions against viewpoint count, with both published measurements marked.</w:t>
       </w:r>
     </w:p>
     <w:p>
@@ -2051,7 +2051,7 @@
         <w:pStyle w:val="BodyText"/>
       </w:pPr>
       <w:r>
-        <w:t xml:space="preserve">One structural guard is worth naming. The scan hands an estimator only quantities a reconstruction would recover, so the true canopy cannot reach an estimator even by accident, and a test asserts it. Making the mistake impossible is worth more than intending not to make it.</w:t>
+        <w:t xml:space="preserve">One structural guard is worth naming. The scan hands an estimator only quantities a reconstruction would recover, so the true canopy cannot reach an estimator even by accident, and a test asserts it. Making the mistake impossible is worth more than intending not to make it. The detector re-run under a better and a worse detector uses thirty fresh trees per setting, ten fitting that setting’s multiplier and twenty scored.</w:t>
       </w:r>
     </w:p>
     <w:p>
@@ -2588,7 +2588,7 @@
         <w:pStyle w:val="BodyText"/>
       </w:pPr>
       <w:r>
-        <w:t xml:space="preserve">The reconstruction estimator is the most accurate at every viewpoint count where it is defined. Its margin over the fitted multiplier is largest in the middle of the range, at 2.3 times better on three viewpoints and 2.1 times on six, and narrows at both ends. At two viewpoints it is only 1.2 times better, because the detection histories are then too short to say much. At twelve there is little left hidden for any method to recover.</w:t>
+        <w:t xml:space="preserve">The reconstruction estimator is the most accurate at every viewpoint count where it is defined. Its margin over the fitted multiplier is largest in the middle of the range, at 2.3 times better on three viewpoints and 2.1 times on six, and narrows at both ends. At two viewpoints it is only 1.2 times better, because the detection histories are then too short to say much. At twelve there is little left hidden for any method to recover. Figure 3 plots error against viewpoint count for every estimator.</w:t>
       </w:r>
     </w:p>
     <w:p>
@@ -2748,7 +2748,7 @@
         <w:pStyle w:val="FirstParagraph"/>
       </w:pPr>
       <w:r>
-        <w:t xml:space="preserve">Plain counting at twelve viewpoints reaches 3.5%. The reconstruction estimator reaches 3.5% at three viewpoints and 2.9% at four, so three viewpoints with it match twelve without, and four beat them. The fitted multiplier never gets there: at twelve viewpoints it reaches 1.9%, but it needs all twelve to do it. For a grower with two hundred trees that is the difference between a morning and a day.</w:t>
+        <w:t xml:space="preserve">Plain counting at twelve viewpoints reaches 3.5%. The reconstruction estimator reaches 3.5% at three viewpoints and 2.9% at four, so three viewpoints with it match twelve without, and four beat them. The fitted multiplier never gets there: at twelve viewpoints it reaches 1.9%, but it needs all twelve to do it. For a grower with two hundred trees that is the difference between a morning and a day. Figure 5 shows how few viewpoints each method needs to reach that line.</w:t>
       </w:r>
     </w:p>
     <w:p>
@@ -3298,7 +3298,7 @@
         <w:pStyle w:val="BodyText"/>
       </w:pPr>
       <w:r>
-        <w:t xml:space="preserve">The advantage holds across canopy density rather than depending on it. What changes with density is how much there is to recover: a dense canopy at two viewpoints hides 43% of its crop from a plain count, an open one at twelve hides 2%.</w:t>
+        <w:t xml:space="preserve">The advantage holds across canopy density rather than depending on it. What changes with density is how much there is to recover: a dense canopy at two viewpoints hides 43% of its crop from a plain count, an open one at twelve hides 2%. Figure 6 splits the same result by canopy density and viewpoint count.</w:t>
       </w:r>
     </w:p>
     <w:p>
@@ -4062,7 +4062,7 @@
         <w:pStyle w:val="BodyText"/>
       </w:pPr>
       <w:r>
-        <w:t xml:space="preserve">This is the practical limit of the method as it stands, and it is a specific and checkable one: do not use it on two viewpoints unless the detector is known to be good.</w:t>
+        <w:t xml:space="preserve">This is the practical limit of the method as it stands, and it is a specific and checkable one: do not use it on two viewpoints unless the detector is known to be good. Figure 7 shows the comparison under all three detectors.</w:t>
       </w:r>
     </w:p>
     <w:p>
@@ -4171,7 +4171,7 @@
         <w:pStyle w:val="BodyText"/>
       </w:pPr>
       <w:r>
-        <w:t xml:space="preserve">Both series are reported for that reason, and a grower using this today should use the uncalibrated interval, which is conservative everywhere and close to correct at the protocols that matter.</w:t>
+        <w:t xml:space="preserve">Both series are reported for that reason, and a grower using this today should use the uncalibrated interval, which is conservative everywhere and close to correct at the protocols that matter. Figure 8 shows coverage and width before and after the correction, against the 90% claimed.</w:t>
       </w:r>
     </w:p>
     <w:p>
@@ -5583,7 +5583,7 @@
         <w:t xml:space="preserve">artifacts/sim_metrics.json</w:t>
       </w:r>
       <w:r>
-        <w:t xml:space="preserve">;</w:t>
+        <w:t xml:space="preserve">, in tens of minutes on a consumer laptop, CPU only;</w:t>
       </w:r>
       <w:r>
         <w:t xml:space="preserve"> </w:t>
@@ -5613,7 +5613,7 @@
         <w:t xml:space="preserve"> </w:t>
       </w:r>
       <w:r>
-        <w:t xml:space="preserve">runs twenty tests, including the closed-form check on the transmittance model.</w:t>
+        <w:t xml:space="preserve">runs twenty tests, including the closed-form check on the transmittance model. The detector settings are labelled optimistic and pessimistic in the code.</w:t>
       </w:r>
     </w:p>
     <w:p>
@@ -5635,7 +5635,7 @@
         <w:t xml:space="preserve"> </w:t>
       </w:r>
       <w:r>
-        <w:t xml:space="preserve">Eighty trees: twenty to fit the multiplier, sixty held out for scoring. Canopy radius 1.8 to 2.8 m, half-height 1.4 to 2.2 m, leaf area density 0.8 to 2.0, fruit load 120 to 600.</w:t>
+        <w:t xml:space="preserve">Eighty trees: twenty to fit the multiplier, sixty held out for scoring. Canopy radius 1.8 to 2.8 m, half-height 1.4 to 2.2 m, leaf area density 0.8 to 2.0, fruit load 120 to 600. Fruit radial position is drawn from a Beta(3,2) distribution, a mean radius of 0.6 of the canopy, and the carved volume is estimated from 2,500 Monte Carlo points per tree.</w:t>
       </w:r>
     </w:p>
     <w:p>
@@ -7061,7 +7061,7 @@
         </m:sSub>
       </m:oMath>
       <w:r>
-        <w:t xml:space="preserve">. Shells with no observable volume take</w:t>
+        <w:t xml:space="preserve">, over eight radial shells. Shells with no observable volume take</w:t>
       </w:r>
       <w:r>
         <w:t xml:space="preserve"> </w:t>
@@ -7093,7 +7093,7 @@
         <w:t xml:space="preserve"> </w:t>
       </w:r>
       <w:r>
-        <w:t xml:space="preserve">By parametric bootstrap: a synthetic tree is drawn with</w:t>
+        <w:t xml:space="preserve">By parametric bootstrap with eighty replicates: a synthetic tree is drawn with</w:t>
       </w:r>
       <w:r>
         <w:t xml:space="preserve"> </w:t>

</xml_diff>